<commit_message>
docs: update License to Publish form with exact official AIST 2026 LNCS volume title
</commit_message>
<xml_diff>
--- a/License_to_Publish_Form_Filled.docx
+++ b/License_to_Publish_Form_Filled.docx
@@ -1,10 +1,10 @@
 
 <file path=word/document.xml><?xml version="1.0" encoding="utf-8"?>
-<w:document xmlns:wpc="http://schemas.microsoft.com/office/word/2010/wordprocessingCanvas" xmlns:cx="http://schemas.microsoft.com/office/drawing/2014/chartex" xmlns:cx1="http://schemas.microsoft.com/office/drawing/2015/9/8/chartex" xmlns:cx2="http://schemas.microsoft.com/office/drawing/2015/10/21/chartex" xmlns:cx3="http://schemas.microsoft.com/office/drawing/2016/5/9/chartex" xmlns:cx4="http://schemas.microsoft.com/office/drawing/2016/5/10/chartex" xmlns:cx5="http://schemas.microsoft.com/office/drawing/2016/5/11/chartex" xmlns:cx6="http://schemas.microsoft.com/office/drawing/2016/5/12/chartex" xmlns:cx7="http://schemas.microsoft.com/office/drawing/2016/5/13/chartex" xmlns:cx8="http://schemas.microsoft.com/office/drawing/2016/5/14/chartex" xmlns:mc="http://schemas.openxmlformats.org/markup-compatibility/2006" xmlns:aink="http://schemas.microsoft.com/office/drawing/2016/ink" xmlns:am3d="http://schemas.microsoft.com/office/drawing/2017/model3d" xmlns:o="urn:schemas-microsoft-com:office:office" xmlns:oel="http://schemas.microsoft.com/office/2019/extlst" xmlns:r="http://schemas.openxmlformats.org/officeDocument/2006/relationships" xmlns:m="http://schemas.openxmlformats.org/officeDocument/2006/math" xmlns:v="urn:schemas-microsoft-com:vml" xmlns:wp14="http://schemas.microsoft.com/office/word/2010/wordprocessingDrawing" xmlns:wp="http://schemas.openxmlformats.org/drawingml/2006/wordprocessingDrawing" xmlns:w10="urn:schemas-microsoft-com:office:word" xmlns:w="http://schemas.openxmlformats.org/wordprocessingml/2006/main" xmlns:w14="http://schemas.microsoft.com/office/word/2010/wordml" xmlns:w15="http://schemas.microsoft.com/office/word/2012/wordml" xmlns:w16cex="http://schemas.microsoft.com/office/word/2018/wordml/cex" xmlns:w16cid="http://schemas.microsoft.com/office/word/2016/wordml/cid" xmlns:w16="http://schemas.microsoft.com/office/word/2018/wordml" xmlns:w16du="http://schemas.microsoft.com/office/word/2023/wordml/word16du" xmlns:w16sdtdh="http://schemas.microsoft.com/office/word/2020/wordml/sdtdatahash" xmlns:w16sdtfl="http://schemas.microsoft.com/office/word/2024/wordml/sdtformatlock" xmlns:w16se="http://schemas.microsoft.com/office/word/2015/wordml/symex" xmlns:wpg="http://schemas.microsoft.com/office/word/2010/wordprocessingGroup" xmlns:wpi="http://schemas.microsoft.com/office/word/2010/wordprocessingInk" xmlns:wne="http://schemas.microsoft.com/office/word/2006/wordml" xmlns:wps="http://schemas.microsoft.com/office/word/2010/wordprocessingShape" mc:Ignorable="w14 w15 w16se w16cid w16 w16cex w16sdtdh w16sdtfl w16du wp14">
+<w:document xmlns:wpc="http://schemas.microsoft.com/office/word/2010/wordprocessingCanvas" xmlns:cx="http://schemas.microsoft.com/office/drawing/2014/chartex" xmlns:cx1="http://schemas.microsoft.com/office/drawing/2015/9/8/chartex" xmlns:cx2="http://schemas.microsoft.com/office/drawing/2015/10/21/chartex" xmlns:cx3="http://schemas.microsoft.com/office/drawing/2016/5/9/chartex" xmlns:cx4="http://schemas.microsoft.com/office/drawing/2016/5/10/chartex" xmlns:cx5="http://schemas.microsoft.com/office/drawing/2016/5/11/chartex" xmlns:cx6="http://schemas.microsoft.com/office/drawing/2016/5/12/chartex" xmlns:cx7="http://schemas.microsoft.com/office/drawing/2016/5/13/chartex" xmlns:cx8="http://schemas.microsoft.com/office/drawing/2016/5/14/chartex" xmlns:mc="http://schemas.openxmlformats.org/markup-compatibility/2006" xmlns:aink="http://schemas.microsoft.com/office/drawing/2016/ink" xmlns:am3d="http://schemas.microsoft.com/office/drawing/2017/model3d" xmlns:o="urn:schemas-microsoft-com:office:office" xmlns:oel="http://schemas.microsoft.com/office/2019/extlst" xmlns:r="http://schemas.openxmlformats.org/officeDocument/2006/relationships" xmlns:m="http://schemas.openxmlformats.org/officeDocument/2006/math" xmlns:v="urn:schemas-microsoft-com:vml" xmlns:wp14="http://schemas.microsoft.com/office/word/2010/wordprocessingDrawing" xmlns:wp="http://schemas.openxmlformats.org/drawingml/2006/wordprocessingDrawing" xmlns:w10="urn:schemas-microsoft-com:office:word" xmlns:w="http://schemas.openxmlformats.org/wordprocessingml/2006/main" xmlns:w14="http://schemas.microsoft.com/office/word/2010/wordml" xmlns:w15="http://schemas.microsoft.com/office/word/2012/wordml" xmlns:w16cei="http://schemas.microsoft.com/office/word/2026/wordml/cei" xmlns:w16cex="http://schemas.microsoft.com/office/word/2018/wordml/cex" xmlns:w16cid="http://schemas.microsoft.com/office/word/2016/wordml/cid" xmlns:w16="http://schemas.microsoft.com/office/word/2018/wordml" xmlns:w16du="http://schemas.microsoft.com/office/word/2023/wordml/word16du" xmlns:w16sdtdh="http://schemas.microsoft.com/office/word/2020/wordml/sdtdatahash" xmlns:w16sdtfl="http://schemas.microsoft.com/office/word/2024/wordml/sdtformatlock" xmlns:w16se="http://schemas.microsoft.com/office/word/2015/wordml/symex" xmlns:wpg="http://schemas.microsoft.com/office/word/2010/wordprocessingGroup" xmlns:wpi="http://schemas.microsoft.com/office/word/2010/wordprocessingInk" xmlns:wne="http://schemas.microsoft.com/office/word/2006/wordml" xmlns:wps="http://schemas.microsoft.com/office/word/2010/wordprocessingShape" mc:Ignorable="w14 w15 w16se w16cid w16 w16cex w16sdtdh w16sdtfl w16du wp14">
   <w:body>
     <w:tbl>
       <w:tblPr>
-        <w:tblStyle w:val="TableGrid"/>
+        <w:tblStyle w:val="a6"/>
         <w:tblW w:w="0" w:type="auto"/>
         <w:tblBorders>
           <w:top w:val="none" w:sz="0" w:space="0" w:color="auto"/>
@@ -29,7 +29,7 @@
           </w:tcPr>
           <w:p>
             <w:pPr>
-              <w:pStyle w:val="Title"/>
+              <w:pStyle w:val="af6"/>
             </w:pPr>
             <w:r>
               <w:t>Licence to Publish</w:t>
@@ -77,7 +77,7 @@
                           </pic:cNvPicPr>
                         </pic:nvPicPr>
                         <pic:blipFill>
-                          <a:blip r:embed="rId12" cstate="print">
+                          <a:blip r:embed="rId13" cstate="print">
                             <a:extLst>
                               <a:ext uri="{28A0092B-C50C-407E-A947-70E740481C1C}">
                                 <a14:useLocalDpi xmlns:a14="http://schemas.microsoft.com/office/drawing/2010/main" val="0"/>
@@ -219,32 +219,11 @@
           <w:tcPr>
             <w:tcW w:w="2394" w:type="pct"/>
           </w:tcPr>
-          <w:sdt>
-            <w:sdtPr>
-              <w:alias w:val="Contract Express"/>
-              <w:tag w:val="d=EntitySelect&amp;r="/>
-              <w:id w:val="1412393161"/>
-            </w:sdtPr>
-            <w:sdtContent>
-              <w:p>
-                <w:pPr>
-                  <w:rPr>
-                    <w:rFonts w:eastAsia="Cambria" w:cstheme="minorHAnsi"/>
-                    <w:sz w:val="16"/>
-                    <w:szCs w:val="16"/>
-                  </w:rPr>
-                </w:pPr>
-                <w:r>
-                  <w:rPr>
-                    <w:rFonts w:cstheme="minorHAnsi"/>
-                    <w:sz w:val="16"/>
-                    <w:szCs w:val="16"/>
-                  </w:rPr>
-                  <w:t>Springer Nature Switzerland AG</w:t>
-                </w:r>
-              </w:p>
-            </w:sdtContent>
-          </w:sdt>
+          <w:p>
+            <w:r>
+              <w:t>Springer Nature Switzerland AG</w:t>
+            </w:r>
+          </w:p>
         </w:tc>
         <w:tc>
           <w:tcPr>
@@ -349,7 +328,6 @@
             <w:placeholder>
               <w:docPart w:val="6A8A996FEC314FAEBC0A8320051A9866"/>
             </w:placeholder>
-            <w:showingPlcHdr/>
           </w:sdtPr>
           <w:sdtContent>
             <w:tc>
@@ -359,9 +337,12 @@
               <w:p>
                 <w:pPr>
                   <w:rPr>
-                    <w:rFonts w:eastAsia="Cambria" w:cstheme="minorHAnsi"/>
+                    <w:rFonts w:eastAsia="Cambria"/>
+                    <w:b/>
+                    <w:bCs/>
                     <w:sz w:val="16"/>
                     <w:szCs w:val="16"/>
+                    <w:lang w:val="ru-KZ"/>
                   </w:rPr>
                 </w:pPr>
                 <w:r>
@@ -369,9 +350,16 @@
                     <w:rFonts w:eastAsia="Cambria" w:cstheme="minorHAnsi"/>
                     <w:sz w:val="16"/>
                     <w:szCs w:val="16"/>
-                    <w:highlight w:val="lightGray"/>
                   </w:rPr>
-                  <w:t>Click here to enter text.</w:t>
+                  <w:t>Analysis of Images, Social Networks and Texts</w:t>
+                </w:r>
+                <w:r>
+                  <w:rPr>
+                    <w:rFonts w:eastAsia="Cambria" w:cstheme="minorHAnsi"/>
+                    <w:sz w:val="16"/>
+                    <w:szCs w:val="16"/>
+                  </w:rPr>
+                  <w:t xml:space="preserve"> (AIST 2026)</w:t>
                 </w:r>
               </w:p>
             </w:tc>
@@ -383,7 +371,7 @@
           </w:tcPr>
           <w:p>
             <w:r>
-              <w:t>Analysis of Images, Social Networks and Texts (AIST 2026)</w:t>
+              <w:t>Analysis of Images, Social Networks and Texts - 13th International Conference, AIST 2026, Astana, Kazakhstan, 16–18 October 2026</w:t>
             </w:r>
           </w:p>
         </w:tc>
@@ -469,7 +457,6 @@
             <w:placeholder>
               <w:docPart w:val="D396DE6BAAE04F078FD6EECA6106629A"/>
             </w:placeholder>
-            <w:showingPlcHdr/>
           </w:sdtPr>
           <w:sdtContent>
             <w:tc>
@@ -489,9 +476,11 @@
                     <w:rFonts w:eastAsia="Cambria" w:cstheme="minorHAnsi"/>
                     <w:sz w:val="16"/>
                     <w:szCs w:val="16"/>
-                    <w:highlight w:val="lightGray"/>
                   </w:rPr>
-                  <w:t>Click here to enter text.</w:t>
+                  <w:t>Evgenii Tsymbalov et al.</w:t>
+                </w:r>
+                <w:r>
+                  <w:t xml:space="preserve"> </w:t>
                 </w:r>
               </w:p>
             </w:tc>
@@ -588,7 +577,6 @@
             <w:placeholder>
               <w:docPart w:val="76DA22AC063543CBB037BC108227BDBA"/>
             </w:placeholder>
-            <w:showingPlcHdr/>
           </w:sdtPr>
           <w:sdtContent>
             <w:tc>
@@ -608,9 +596,8 @@
                     <w:rFonts w:eastAsia="Cambria" w:cstheme="minorHAnsi"/>
                     <w:sz w:val="16"/>
                     <w:szCs w:val="16"/>
-                    <w:highlight w:val="lightGray"/>
                   </w:rPr>
-                  <w:t>Click here to enter text.</w:t>
+                  <w:t>Detecting AI-Generated User Reviews in Kazakh: A Study on BERT Model Performance and False Positive Reduction</w:t>
                 </w:r>
               </w:p>
             </w:tc>
@@ -834,7 +821,6 @@
             <w:placeholder>
               <w:docPart w:val="75F61420D7214EC6A79537ACAAEFFE02"/>
             </w:placeholder>
-            <w:showingPlcHdr/>
           </w:sdtPr>
           <w:sdtContent>
             <w:tc>
@@ -854,9 +840,8 @@
                     <w:rFonts w:eastAsia="Cambria" w:cstheme="minorHAnsi"/>
                     <w:sz w:val="16"/>
                     <w:szCs w:val="16"/>
-                    <w:highlight w:val="lightGray"/>
                   </w:rPr>
-                  <w:t>Click here to enter text.</w:t>
+                  <w:t>Daulet Anekesh, Irina Ualiyeva</w:t>
                 </w:r>
               </w:p>
             </w:tc>
@@ -1036,7 +1021,6 @@
             <w:placeholder>
               <w:docPart w:val="C3586137BDCA4C559954704D6C1621B6"/>
             </w:placeholder>
-            <w:showingPlcHdr/>
           </w:sdtPr>
           <w:sdtContent>
             <w:tc>
@@ -1056,10 +1040,19 @@
                     <w:rFonts w:eastAsia="Cambria" w:cstheme="minorHAnsi"/>
                     <w:sz w:val="16"/>
                     <w:szCs w:val="16"/>
-                    <w:highlight w:val="lightGray"/>
                   </w:rPr>
-                  <w:t>Click here to enter text.</w:t>
+                  <w:t xml:space="preserve">Daulet </w:t>
                 </w:r>
+                <w:proofErr w:type="spellStart"/>
+                <w:r>
+                  <w:rPr>
+                    <w:rFonts w:eastAsia="Cambria" w:cstheme="minorHAnsi"/>
+                    <w:sz w:val="16"/>
+                    <w:szCs w:val="16"/>
+                  </w:rPr>
+                  <w:t>Anekesh</w:t>
+                </w:r>
+                <w:proofErr w:type="spellEnd"/>
               </w:p>
             </w:tc>
           </w:sdtContent>
@@ -1189,15 +1182,33 @@
                 <w:szCs w:val="16"/>
               </w:rPr>
             </w:pPr>
-            <w:hyperlink r:id="rId13" w:history="1">
+            <w:hyperlink r:id="rId14" w:history="1">
               <w:r>
                 <w:rPr>
-                  <w:rStyle w:val="Hyperlink"/>
+                  <w:rStyle w:val="af3"/>
                   <w:rFonts w:cstheme="minorHAnsi"/>
                   <w:sz w:val="16"/>
                   <w:szCs w:val="16"/>
                 </w:rPr>
-                <w:t>https://www.springernature.com/gp/authors/publish-a-book/step-by-step-conference-proceedings</w:t>
+                <w:t>https://www.springernature.com/gp/authors/publish-a-book/step-by-step-conference-</w:t>
+              </w:r>
+              <w:r>
+                <w:rPr>
+                  <w:rStyle w:val="af3"/>
+                  <w:rFonts w:cstheme="minorHAnsi"/>
+                  <w:sz w:val="16"/>
+                  <w:szCs w:val="16"/>
+                </w:rPr>
+                <w:t>p</w:t>
+              </w:r>
+              <w:r>
+                <w:rPr>
+                  <w:rStyle w:val="af3"/>
+                  <w:rFonts w:cstheme="minorHAnsi"/>
+                  <w:sz w:val="16"/>
+                  <w:szCs w:val="16"/>
+                </w:rPr>
+                <w:t>roceedings</w:t>
               </w:r>
             </w:hyperlink>
           </w:p>
@@ -1248,7 +1259,7 @@
     </w:p>
     <w:p>
       <w:pPr>
-        <w:pStyle w:val="Heading1"/>
+        <w:pStyle w:val="1"/>
       </w:pPr>
       <w:r>
         <w:t>Grant of Rights</w:t>
@@ -1493,29 +1504,7 @@
           <w:szCs w:val="20"/>
           <w:lang w:val="en-US" w:eastAsia="en-GB"/>
         </w:rPr>
-        <w:t>(</w:t>
-      </w:r>
-      <w:proofErr w:type="spellStart"/>
-      <w:r>
-        <w:rPr>
-          <w:rFonts w:eastAsia="Arial" w:cstheme="minorHAnsi"/>
-          <w:bCs/>
-          <w:sz w:val="20"/>
-          <w:szCs w:val="20"/>
-          <w:lang w:val="en-US" w:eastAsia="en-GB"/>
-        </w:rPr>
-        <w:t>i</w:t>
-      </w:r>
-      <w:proofErr w:type="spellEnd"/>
-      <w:r>
-        <w:rPr>
-          <w:rFonts w:eastAsia="Arial" w:cstheme="minorHAnsi"/>
-          <w:bCs/>
-          <w:sz w:val="20"/>
-          <w:szCs w:val="20"/>
-          <w:lang w:val="en-US" w:eastAsia="en-GB"/>
-        </w:rPr>
-        <w:t>) the right to edit, alter, adapt, adjust and prepare derivative works;</w:t>
+        <w:t>(i) the right to edit, alter, adapt, adjust and prepare derivative works;</w:t>
       </w:r>
       <w:r>
         <w:rPr>
@@ -2136,7 +2125,7 @@
     </w:p>
     <w:p>
       <w:pPr>
-        <w:pStyle w:val="Heading1"/>
+        <w:pStyle w:val="1"/>
       </w:pPr>
       <w:r>
         <w:t>Copyright</w:t>
@@ -2227,7 +2216,7 @@
     </w:p>
     <w:p>
       <w:pPr>
-        <w:pStyle w:val="Heading1"/>
+        <w:pStyle w:val="1"/>
       </w:pPr>
       <w:r>
         <w:t>Accessibility</w:t>
@@ -2318,7 +2307,7 @@
     </w:p>
     <w:p>
       <w:pPr>
-        <w:pStyle w:val="Heading1"/>
+        <w:pStyle w:val="1"/>
       </w:pPr>
       <w:r>
         <w:t>Use of Contribution Versions</w:t>
@@ -2349,29 +2338,7 @@
           <w:szCs w:val="20"/>
           <w:lang w:eastAsia="en-GB"/>
         </w:rPr>
-        <w:t>For purposes of this Agreement: (</w:t>
-      </w:r>
-      <w:proofErr w:type="spellStart"/>
-      <w:r>
-        <w:rPr>
-          <w:rFonts w:eastAsia="Arial" w:cstheme="minorHAnsi"/>
-          <w:bCs/>
-          <w:sz w:val="20"/>
-          <w:szCs w:val="20"/>
-          <w:lang w:eastAsia="en-GB"/>
-        </w:rPr>
-        <w:t>i</w:t>
-      </w:r>
-      <w:proofErr w:type="spellEnd"/>
-      <w:r>
-        <w:rPr>
-          <w:rFonts w:eastAsia="Arial" w:cstheme="minorHAnsi"/>
-          <w:bCs/>
-          <w:sz w:val="20"/>
-          <w:szCs w:val="20"/>
-          <w:lang w:eastAsia="en-GB"/>
-        </w:rPr>
-        <w:t>) references to the “Contribution” include all versions of the Contribution; (ii) “Submitted Manuscript” means the version of the Contribution as first submitted by the Author prior to peer review; (iii) “Accepted Manuscript” means the version of the Contribution accepted for publication, but prior to copy-editing and typesetting; and (iv) “Version of Record” means the version of the Contribution published by the Licensee, after copy-editing and typesetting. Rights to all versions of the Manuscript are granted on an exclusive basis, except for the Submitted Manuscript, to which rights are granted on a non-exclusive basis</w:t>
+        <w:t>For purposes of this Agreement: (i) references to the “Contribution” include all versions of the Contribution; (ii) “Submitted Manuscript” means the version of the Contribution as first submitted by the Author prior to peer review; (iii) “Accepted Manuscript” means the version of the Contribution accepted for publication, but prior to copy-editing and typesetting; and (iv) “Version of Record” means the version of the Contribution published by the Licensee, after copy-editing and typesetting. Rights to all versions of the Manuscript are granted on an exclusive basis, except for the Submitted Manuscript, to which rights are granted on a non-exclusive basis</w:t>
       </w:r>
       <w:r>
         <w:rPr>
@@ -2496,7 +2463,7 @@
           <w:szCs w:val="20"/>
           <w:lang w:eastAsia="en-GB"/>
         </w:rPr>
-        <w:t xml:space="preserve"> will include an acknowledgement and provide a link to </w:t>
+        <w:t xml:space="preserve"> will include an acknowledgement and provide a link to the Version of Record on the publisher’s website: “This preprint has not undergone peer review </w:t>
       </w:r>
       <w:r>
         <w:rPr>
@@ -2507,7 +2474,7 @@
           <w:lang w:eastAsia="en-GB"/>
         </w:rPr>
         <w:lastRenderedPageBreak/>
-        <w:t>the Version of Record on the publisher’s website: “This preprint has not undergone peer review (when applicable) or any post-submission improvements or corrections. The Version of Record of this contribution is published in [insert volume title</w:t>
+        <w:t>(when applicable) or any post-submission improvements or corrections. The Version of Record of this contribution is published in [insert volume title</w:t>
       </w:r>
       <w:proofErr w:type="gramStart"/>
       <w:r>
@@ -2618,29 +2585,7 @@
           <w:szCs w:val="20"/>
           <w:lang w:eastAsia="en-GB"/>
         </w:rPr>
-        <w:t>(</w:t>
-      </w:r>
-      <w:proofErr w:type="spellStart"/>
-      <w:r>
-        <w:rPr>
-          <w:rFonts w:eastAsia="Arial" w:cstheme="minorHAnsi"/>
-          <w:bCs/>
-          <w:sz w:val="20"/>
-          <w:szCs w:val="20"/>
-          <w:lang w:eastAsia="en-GB"/>
-        </w:rPr>
-        <w:t>i</w:t>
-      </w:r>
-      <w:proofErr w:type="spellEnd"/>
-      <w:r>
-        <w:rPr>
-          <w:rFonts w:eastAsia="Arial" w:cstheme="minorHAnsi"/>
-          <w:bCs/>
-          <w:sz w:val="20"/>
-          <w:szCs w:val="20"/>
-          <w:lang w:eastAsia="en-GB"/>
-        </w:rPr>
-        <w:t>) the right to make the Accepted Manuscript available on their own personal, self-maintained website immediately on acceptance, (ii) the right to make the Accepted Manuscript available for public release on any of the following twelve (12) months after first publication (the "Embargo Period"): their employer’s internal website; their institutional and/or funder repositories. Accepted Manuscripts may be deposited in such repositories immediately upon acceptance, provided they are not made publicly available until after the Embargo Period.</w:t>
+        <w:t>(i) the right to make the Accepted Manuscript available on their own personal, self-maintained website immediately on acceptance, (ii) the right to make the Accepted Manuscript available for public release on any of the following twelve (12) months after first publication (the "Embargo Period"): their employer’s internal website; their institutional and/or funder repositories. Accepted Manuscripts may be deposited in such repositories immediately upon acceptance, provided they are not made publicly available until after the Embargo Period.</w:t>
       </w:r>
       <w:r>
         <w:rPr>
@@ -2680,29 +2625,7 @@
           <w:szCs w:val="20"/>
           <w:lang w:eastAsia="en-GB"/>
         </w:rPr>
-        <w:t xml:space="preserve"> with respect to the Accepted Manuscript are subject to the conditions that (</w:t>
-      </w:r>
-      <w:proofErr w:type="spellStart"/>
-      <w:r>
-        <w:rPr>
-          <w:rFonts w:eastAsia="Arial" w:cstheme="minorHAnsi"/>
-          <w:bCs/>
-          <w:sz w:val="20"/>
-          <w:szCs w:val="20"/>
-          <w:lang w:eastAsia="en-GB"/>
-        </w:rPr>
-        <w:t>i</w:t>
-      </w:r>
-      <w:proofErr w:type="spellEnd"/>
-      <w:r>
-        <w:rPr>
-          <w:rFonts w:eastAsia="Arial" w:cstheme="minorHAnsi"/>
-          <w:bCs/>
-          <w:sz w:val="20"/>
-          <w:szCs w:val="20"/>
-          <w:lang w:eastAsia="en-GB"/>
-        </w:rPr>
-        <w:t xml:space="preserve">) the Accepted Manuscript is not enhanced or substantially reformatted by the </w:t>
+        <w:t xml:space="preserve"> with respect to the Accepted Manuscript are subject to the conditions that (i) the Accepted Manuscript is not enhanced or substantially reformatted by the </w:t>
       </w:r>
       <w:sdt>
         <w:sdtPr>
@@ -2711,6 +2634,7 @@
           <w:id w:val="1546199706"/>
         </w:sdtPr>
         <w:sdtContent>
+          <w:proofErr w:type="spellStart"/>
           <w:r>
             <w:rPr>
               <w:rFonts w:eastAsia="Arial" w:cstheme="minorHAnsi"/>
@@ -2721,6 +2645,7 @@
             </w:rPr>
             <w:t>Author</w:t>
           </w:r>
+          <w:proofErr w:type="spellEnd"/>
         </w:sdtContent>
       </w:sdt>
       <w:r>
@@ -2740,6 +2665,7 @@
           <w:id w:val="1545959259"/>
         </w:sdtPr>
         <w:sdtContent>
+          <w:proofErr w:type="spellStart"/>
           <w:r>
             <w:rPr>
               <w:rFonts w:eastAsia="Arial" w:cstheme="minorHAnsi"/>
@@ -2750,6 +2676,7 @@
             </w:rPr>
             <w:t>Author</w:t>
           </w:r>
+          <w:proofErr w:type="spellEnd"/>
         </w:sdtContent>
       </w:sdt>
       <w:r>
@@ -2784,10 +2711,10 @@
         </w:rPr>
         <w:t xml:space="preserve">insert DOI]. Use of this Accepted Version is subject to the publisher’s Accepted Manuscript terms of use </w:t>
       </w:r>
-      <w:hyperlink r:id="rId14" w:history="1">
+      <w:hyperlink r:id="rId15" w:history="1">
         <w:r>
           <w:rPr>
-            <w:rStyle w:val="Hyperlink"/>
+            <w:rStyle w:val="af3"/>
             <w:rFonts w:eastAsia="Arial" w:cstheme="minorHAnsi"/>
             <w:bCs/>
             <w:sz w:val="20"/>
@@ -2969,29 +2896,7 @@
           <w:szCs w:val="20"/>
           <w:lang w:eastAsia="en-GB"/>
         </w:rPr>
-        <w:t xml:space="preserve"> and contained in the Contribution, in presentations and other works created by </w:t>
-      </w:r>
-      <w:proofErr w:type="gramStart"/>
-      <w:r>
-        <w:rPr>
-          <w:rFonts w:eastAsia="Arial" w:cstheme="minorHAnsi"/>
-          <w:bCs/>
-          <w:sz w:val="20"/>
-          <w:szCs w:val="20"/>
-          <w:lang w:eastAsia="en-GB"/>
-        </w:rPr>
-        <w:t>them;</w:t>
-      </w:r>
-      <w:proofErr w:type="gramEnd"/>
-      <w:r>
-        <w:rPr>
-          <w:rFonts w:eastAsia="Arial" w:cstheme="minorHAnsi"/>
-          <w:bCs/>
-          <w:sz w:val="20"/>
-          <w:szCs w:val="20"/>
-          <w:lang w:eastAsia="en-GB"/>
-        </w:rPr>
-        <w:t xml:space="preserve"> </w:t>
+        <w:t xml:space="preserve"> and contained in the Contribution, in presentations and other works created by them; </w:t>
       </w:r>
     </w:p>
     <w:p>
@@ -3019,29 +2924,7 @@
           <w:szCs w:val="20"/>
           <w:lang w:eastAsia="en-GB"/>
         </w:rPr>
-        <w:t>the Author and any academic institution where they work at the time may reproduce the Contribution for the purpose of course teaching (but not for inclusion in course pack material for onward sale by libraries and institutions</w:t>
-      </w:r>
-      <w:proofErr w:type="gramStart"/>
-      <w:r>
-        <w:rPr>
-          <w:rFonts w:eastAsia="Arial" w:cstheme="minorHAnsi"/>
-          <w:bCs/>
-          <w:sz w:val="20"/>
-          <w:szCs w:val="20"/>
-          <w:lang w:eastAsia="en-GB"/>
-        </w:rPr>
-        <w:t>);</w:t>
-      </w:r>
-      <w:proofErr w:type="gramEnd"/>
-      <w:r>
-        <w:rPr>
-          <w:rFonts w:eastAsia="Arial" w:cstheme="minorHAnsi"/>
-          <w:bCs/>
-          <w:sz w:val="20"/>
-          <w:szCs w:val="20"/>
-          <w:lang w:eastAsia="en-GB"/>
-        </w:rPr>
-        <w:t xml:space="preserve"> </w:t>
+        <w:t xml:space="preserve">the Author and any academic institution where they work at the time may reproduce the Contribution for the purpose of course teaching (but not for inclusion in course pack material for onward sale by libraries and institutions); </w:t>
       </w:r>
     </w:p>
     <w:p>
@@ -3069,20 +2952,8 @@
           <w:szCs w:val="20"/>
           <w:lang w:eastAsia="en-GB"/>
         </w:rPr>
-        <w:t>to reuse the Version of Record or any part in a thesis written by the same Author, and to make a copy of that thesis available in a repository of the Author(s)’ awarding academic institution, or other repository required by the awarding academic institution. An acknowledgement should be included in the citation: “Reproduced with permission from Springer Nature</w:t>
-      </w:r>
-      <w:proofErr w:type="gramStart"/>
-      <w:r>
-        <w:rPr>
-          <w:rFonts w:eastAsia="Arial" w:cstheme="minorHAnsi"/>
-          <w:bCs/>
-          <w:sz w:val="20"/>
-          <w:szCs w:val="20"/>
-          <w:lang w:eastAsia="en-GB"/>
-        </w:rPr>
-        <w:t>”;</w:t>
-      </w:r>
-      <w:proofErr w:type="gramEnd"/>
+        <w:t>to reuse the Version of Record or any part in a thesis written by the same Author, and to make a copy of that thesis available in a repository of the Author(s)’ awarding academic institution, or other repository required by the awarding academic institution. An acknowledgement should be included in the citation: “Reproduced with permission from Springer Nature”;</w:t>
+      </w:r>
     </w:p>
     <w:p>
       <w:pPr>
@@ -3176,29 +3047,7 @@
           <w:szCs w:val="20"/>
           <w:lang w:eastAsia="en-GB"/>
         </w:rPr>
-        <w:t>to publish an expanded version of their Contribution provided the expanded version (</w:t>
-      </w:r>
-      <w:proofErr w:type="spellStart"/>
-      <w:r>
-        <w:rPr>
-          <w:rFonts w:eastAsia="Arial" w:cstheme="minorHAnsi"/>
-          <w:bCs/>
-          <w:sz w:val="20"/>
-          <w:szCs w:val="20"/>
-          <w:lang w:eastAsia="en-GB"/>
-        </w:rPr>
-        <w:t>i</w:t>
-      </w:r>
-      <w:proofErr w:type="spellEnd"/>
-      <w:r>
-        <w:rPr>
-          <w:rFonts w:eastAsia="Arial" w:cstheme="minorHAnsi"/>
-          <w:bCs/>
-          <w:sz w:val="20"/>
-          <w:szCs w:val="20"/>
-          <w:lang w:eastAsia="en-GB"/>
-        </w:rPr>
-        <w:t xml:space="preserve">) </w:t>
+        <w:t xml:space="preserve">to publish an expanded version of their Contribution provided the expanded version (i) includes at least 30% new material (ii) includes an express statement specifying the </w:t>
       </w:r>
       <w:r>
         <w:rPr>
@@ -3209,12 +3058,12 @@
           <w:lang w:eastAsia="en-GB"/>
         </w:rPr>
         <w:lastRenderedPageBreak/>
-        <w:t>includes at least 30% new material (ii) includes an express statement specifying the incremental change in the expanded version (e.g., new results, better description of materials, etc.).</w:t>
+        <w:t>incremental change in the expanded version (e.g., new results, better description of materials, etc.).</w:t>
       </w:r>
     </w:p>
     <w:p>
       <w:pPr>
-        <w:pStyle w:val="Heading1"/>
+        <w:pStyle w:val="1"/>
       </w:pPr>
       <w:r>
         <w:t>Warranties &amp; Representations</w:t>
@@ -3592,29 +3441,7 @@
           <w:szCs w:val="20"/>
           <w:lang w:eastAsia="en-GB"/>
         </w:rPr>
-        <w:t xml:space="preserve"> the facts contained in the Contribution are according to the current body of research true and </w:t>
-      </w:r>
-      <w:proofErr w:type="gramStart"/>
-      <w:r>
-        <w:rPr>
-          <w:rFonts w:eastAsia="Arial" w:cstheme="minorHAnsi"/>
-          <w:bCs/>
-          <w:sz w:val="20"/>
-          <w:szCs w:val="20"/>
-          <w:lang w:eastAsia="en-GB"/>
-        </w:rPr>
-        <w:t>accurate;</w:t>
-      </w:r>
-      <w:proofErr w:type="gramEnd"/>
-      <w:r>
-        <w:rPr>
-          <w:rFonts w:eastAsia="Arial" w:cstheme="minorHAnsi"/>
-          <w:bCs/>
-          <w:sz w:val="20"/>
-          <w:szCs w:val="20"/>
-          <w:lang w:eastAsia="en-GB"/>
-        </w:rPr>
-        <w:t xml:space="preserve"> </w:t>
+        <w:t xml:space="preserve"> the facts contained in the Contribution are according to the current body of research true and accurate; </w:t>
       </w:r>
     </w:p>
     <w:p>
@@ -3642,20 +3469,8 @@
           <w:szCs w:val="20"/>
           <w:lang w:eastAsia="en-GB"/>
         </w:rPr>
-        <w:t xml:space="preserve">nothing in the Contribution is obscene, defamatory, violates any right of privacy or publicity, infringes any other human, personal or other rights of any person or entity or is otherwise unlawful and that informed consent to publish has been obtained for any research </w:t>
-      </w:r>
-      <w:proofErr w:type="gramStart"/>
-      <w:r>
-        <w:rPr>
-          <w:rFonts w:eastAsia="Arial" w:cstheme="minorHAnsi"/>
-          <w:bCs/>
-          <w:sz w:val="20"/>
-          <w:szCs w:val="20"/>
-          <w:lang w:eastAsia="en-GB"/>
-        </w:rPr>
-        <w:t>participants;</w:t>
-      </w:r>
-      <w:proofErr w:type="gramEnd"/>
+        <w:t>nothing in the Contribution is obscene, defamatory, violates any right of privacy or publicity, infringes any other human, personal or other rights of any person or entity or is otherwise unlawful and that informed consent to publish has been obtained for any research participants;</w:t>
+      </w:r>
     </w:p>
     <w:p>
       <w:pPr>
@@ -3739,20 +3554,8 @@
           <w:szCs w:val="20"/>
           <w:lang w:eastAsia="en-GB"/>
         </w:rPr>
-        <w:t xml:space="preserve">all institutional, governmental, and/or other approvals which may be required in connection with the research reflected in the Contribution have been obtained and continue in </w:t>
-      </w:r>
-      <w:proofErr w:type="gramStart"/>
-      <w:r>
-        <w:rPr>
-          <w:rFonts w:eastAsia="Arial" w:cstheme="minorHAnsi"/>
-          <w:bCs/>
-          <w:sz w:val="20"/>
-          <w:szCs w:val="20"/>
-          <w:lang w:eastAsia="en-GB"/>
-        </w:rPr>
-        <w:t>effect;</w:t>
-      </w:r>
-      <w:proofErr w:type="gramEnd"/>
+        <w:t>all institutional, governmental, and/or other approvals which may be required in connection with the research reflected in the Contribution have been obtained and continue in effect;</w:t>
+      </w:r>
     </w:p>
     <w:p>
       <w:pPr>
@@ -3808,20 +3611,8 @@
           <w:szCs w:val="20"/>
           <w:lang w:eastAsia="en-GB"/>
         </w:rPr>
-        <w:t xml:space="preserve"> in connection with the Contribution are true and </w:t>
-      </w:r>
-      <w:proofErr w:type="gramStart"/>
-      <w:r>
-        <w:rPr>
-          <w:rFonts w:eastAsia="Arial" w:cstheme="minorHAnsi"/>
-          <w:bCs/>
-          <w:sz w:val="20"/>
-          <w:szCs w:val="20"/>
-          <w:lang w:eastAsia="en-GB"/>
-        </w:rPr>
-        <w:t>correct;</w:t>
-      </w:r>
-      <w:proofErr w:type="gramEnd"/>
+        <w:t xml:space="preserve"> in connection with the Contribution are true and correct;</w:t>
+      </w:r>
     </w:p>
     <w:p>
       <w:pPr>
@@ -3949,53 +3740,19 @@
           <w:szCs w:val="20"/>
           <w:lang w:eastAsia="en-GB"/>
         </w:rPr>
-        <w:t xml:space="preserve"> </w:t>
-      </w:r>
-      <w:proofErr w:type="spellStart"/>
-      <w:r>
-        <w:rPr>
-          <w:rFonts w:eastAsia="Arial" w:cstheme="minorHAnsi"/>
-          <w:bCs/>
-          <w:sz w:val="20"/>
-          <w:szCs w:val="20"/>
-          <w:lang w:eastAsia="en-GB"/>
-        </w:rPr>
-        <w:t>i</w:t>
-      </w:r>
-      <w:proofErr w:type="spellEnd"/>
-      <w:r>
-        <w:rPr>
-          <w:rFonts w:eastAsia="Arial" w:cstheme="minorHAnsi"/>
-          <w:bCs/>
-          <w:sz w:val="20"/>
-          <w:szCs w:val="20"/>
-          <w:lang w:eastAsia="en-GB"/>
-        </w:rPr>
-        <w:t xml:space="preserve">. all instructions and policies in the Instructions for Authors, ii. the Licensee’s ethics rules (available at </w:t>
-      </w:r>
-      <w:hyperlink r:id="rId15" w:history="1">
+        <w:t xml:space="preserve"> i. all instructions and policies in the Instructions for Authors, ii. the Licensee’s ethics rules (available at </w:t>
+      </w:r>
+      <w:hyperlink r:id="rId16" w:history="1">
         <w:r>
           <w:rPr>
-            <w:rStyle w:val="Hyperlink"/>
+            <w:rStyle w:val="af3"/>
             <w:rFonts w:eastAsia="Arial" w:cstheme="minorHAnsi"/>
             <w:bCs/>
             <w:sz w:val="20"/>
             <w:szCs w:val="20"/>
             <w:lang w:eastAsia="en-GB"/>
           </w:rPr>
-          <w:t>https://www.springernature.com/gp/authors/book-authors-</w:t>
-        </w:r>
-        <w:r>
-          <w:rPr>
-            <w:rStyle w:val="Hyperlink"/>
-            <w:rFonts w:eastAsia="Arial" w:cstheme="minorHAnsi"/>
-            <w:bCs/>
-            <w:sz w:val="20"/>
-            <w:szCs w:val="20"/>
-            <w:lang w:eastAsia="en-GB"/>
-          </w:rPr>
-          <w:lastRenderedPageBreak/>
-          <w:t>code-of-conduct</w:t>
+          <w:t>https://www.springernature.com/gp/authors/book-authors-code-of-conduct</w:t>
         </w:r>
       </w:hyperlink>
       <w:r>
@@ -4011,7 +3768,7 @@
     </w:p>
     <w:p>
       <w:pPr>
-        <w:pStyle w:val="Heading1"/>
+        <w:pStyle w:val="1"/>
       </w:pPr>
       <w:r>
         <w:t>Cooperation</w:t>
@@ -4071,7 +3828,18 @@
           <w:szCs w:val="20"/>
           <w:lang w:eastAsia="en-GB"/>
         </w:rPr>
-        <w:t xml:space="preserve"> in this Agreement, the </w:t>
+        <w:t xml:space="preserve"> in this Agreement, </w:t>
+      </w:r>
+      <w:r>
+        <w:rPr>
+          <w:rFonts w:eastAsia="Arial" w:cstheme="minorHAnsi"/>
+          <w:bCs/>
+          <w:sz w:val="20"/>
+          <w:szCs w:val="20"/>
+          <w:lang w:eastAsia="en-GB"/>
+        </w:rPr>
+        <w:lastRenderedPageBreak/>
+        <w:t xml:space="preserve">the </w:t>
       </w:r>
       <w:sdt>
         <w:sdtPr>
@@ -4220,7 +3988,7 @@
     </w:p>
     <w:p>
       <w:pPr>
-        <w:pStyle w:val="Heading1"/>
+        <w:pStyle w:val="1"/>
       </w:pPr>
       <w:r>
         <w:t>Author List</w:t>
@@ -4253,7 +4021,7 @@
     </w:p>
     <w:p>
       <w:pPr>
-        <w:pStyle w:val="Heading1"/>
+        <w:pStyle w:val="1"/>
       </w:pPr>
       <w:r>
         <w:t>Post Publication Actions</w:t>
@@ -4315,7 +4083,7 @@
     </w:p>
     <w:p>
       <w:pPr>
-        <w:pStyle w:val="Heading1"/>
+        <w:pStyle w:val="1"/>
       </w:pPr>
       <w:r>
         <w:t>Controlling Terms</w:t>
@@ -4387,7 +4155,7 @@
     </w:p>
     <w:p>
       <w:pPr>
-        <w:pStyle w:val="Heading1"/>
+        <w:pStyle w:val="1"/>
       </w:pPr>
       <w:r>
         <w:t>Governing Law</w:t>
@@ -4561,7 +4329,7 @@
     </w:p>
     <w:tbl>
       <w:tblPr>
-        <w:tblStyle w:val="TableGrid"/>
+        <w:tblStyle w:val="a6"/>
         <w:tblW w:w="11169" w:type="dxa"/>
         <w:tblInd w:w="-993" w:type="dxa"/>
         <w:tblBorders>
@@ -4659,7 +4427,7 @@
           </w:tcPr>
           <w:p>
             <w:r>
-              <w:t>Date: August 18, 2026</w:t>
+              <w:t>Date: August 20, 2026</w:t>
             </w:r>
           </w:p>
         </w:tc>
@@ -4680,15 +4448,7 @@
             <w:vAlign w:val="center"/>
           </w:tcPr>
           <w:p>
-            <w:pPr>
-              <w:spacing w:before="120" w:after="120"/>
-              <w:jc w:val="center"/>
-              <w:rPr>
-                <w:rFonts w:asciiTheme="minorHAnsi" w:hAnsiTheme="minorHAnsi" w:cstheme="minorHAnsi"/>
-                <w:sz w:val="12"/>
-                <w:szCs w:val="18"/>
-              </w:rPr>
-            </w:pPr>
+            <w:r/>
           </w:p>
         </w:tc>
         <w:tc>
@@ -4700,14 +4460,7 @@
             </w:tcBorders>
           </w:tcPr>
           <w:p>
-            <w:pPr>
-              <w:spacing w:before="120" w:after="120"/>
-              <w:rPr>
-                <w:rFonts w:asciiTheme="minorHAnsi" w:hAnsiTheme="minorHAnsi" w:cstheme="minorHAnsi"/>
-                <w:sz w:val="12"/>
-                <w:szCs w:val="18"/>
-              </w:rPr>
-            </w:pPr>
+            <w:r/>
           </w:p>
         </w:tc>
         <w:tc>
@@ -4722,105 +4475,7 @@
             <w:vAlign w:val="center"/>
           </w:tcPr>
           <w:p>
-            <w:pPr>
-              <w:spacing w:before="120" w:after="120"/>
-              <w:rPr>
-                <w:rFonts w:asciiTheme="minorHAnsi" w:hAnsiTheme="minorHAnsi" w:cstheme="minorHAnsi"/>
-                <w:sz w:val="14"/>
-                <w:szCs w:val="18"/>
-              </w:rPr>
-            </w:pPr>
-            <w:r>
-              <w:rPr>
-                <w:rFonts w:cstheme="minorHAnsi"/>
-                <w:sz w:val="14"/>
-                <w:szCs w:val="18"/>
-              </w:rPr>
-              <w:fldChar w:fldCharType="begin">
-                <w:ffData>
-                  <w:name w:val="Text6"/>
-                  <w:enabled/>
-                  <w:calcOnExit w:val="0"/>
-                  <w:textInput/>
-                </w:ffData>
-              </w:fldChar>
-            </w:r>
-            <w:r>
-              <w:rPr>
-                <w:rFonts w:asciiTheme="minorHAnsi" w:hAnsiTheme="minorHAnsi" w:cstheme="minorHAnsi"/>
-                <w:sz w:val="14"/>
-                <w:szCs w:val="18"/>
-              </w:rPr>
-              <w:instrText xml:space="preserve"> FORMTEXT </w:instrText>
-            </w:r>
-            <w:r>
-              <w:rPr>
-                <w:rFonts w:cstheme="minorHAnsi"/>
-                <w:sz w:val="14"/>
-                <w:szCs w:val="18"/>
-              </w:rPr>
-            </w:r>
-            <w:r>
-              <w:rPr>
-                <w:rFonts w:cstheme="minorHAnsi"/>
-                <w:sz w:val="14"/>
-                <w:szCs w:val="18"/>
-              </w:rPr>
-              <w:fldChar w:fldCharType="separate"/>
-            </w:r>
-            <w:r>
-              <w:rPr>
-                <w:rFonts w:asciiTheme="minorHAnsi" w:hAnsiTheme="minorHAnsi" w:cstheme="minorHAnsi"/>
-                <w:noProof/>
-                <w:sz w:val="14"/>
-                <w:szCs w:val="18"/>
-              </w:rPr>
-              <w:t> </w:t>
-            </w:r>
-            <w:r>
-              <w:rPr>
-                <w:rFonts w:asciiTheme="minorHAnsi" w:hAnsiTheme="minorHAnsi" w:cstheme="minorHAnsi"/>
-                <w:noProof/>
-                <w:sz w:val="14"/>
-                <w:szCs w:val="18"/>
-              </w:rPr>
-              <w:t> </w:t>
-            </w:r>
-            <w:r>
-              <w:rPr>
-                <w:rFonts w:asciiTheme="minorHAnsi" w:hAnsiTheme="minorHAnsi" w:cstheme="minorHAnsi"/>
-                <w:noProof/>
-                <w:sz w:val="14"/>
-                <w:szCs w:val="18"/>
-              </w:rPr>
-              <w:t> </w:t>
-            </w:r>
-            <w:r>
-              <w:rPr>
-                <w:rFonts w:asciiTheme="minorHAnsi" w:hAnsiTheme="minorHAnsi" w:cstheme="minorHAnsi"/>
-                <w:noProof/>
-                <w:sz w:val="14"/>
-                <w:szCs w:val="18"/>
-              </w:rPr>
-              <w:t> </w:t>
-            </w:r>
-            <w:r>
-              <w:rPr>
-                <w:rFonts w:asciiTheme="minorHAnsi" w:hAnsiTheme="minorHAnsi" w:cstheme="minorHAnsi"/>
-                <w:noProof/>
-                <w:sz w:val="14"/>
-                <w:szCs w:val="18"/>
-              </w:rPr>
-              <w:t> </w:t>
-            </w:r>
-            <w:r>
-              <w:rPr>
-                <w:rFonts w:cstheme="minorHAnsi"/>
-                <w:sz w:val="14"/>
-                <w:szCs w:val="18"/>
-              </w:rPr>
-              <w:fldChar w:fldCharType="end"/>
-            </w:r>
+            <w:r/>
           </w:p>
         </w:tc>
         <w:tc>
@@ -4832,14 +4487,7 @@
             </w:tcBorders>
           </w:tcPr>
           <w:p>
-            <w:pPr>
-              <w:spacing w:before="120" w:after="120"/>
-              <w:rPr>
-                <w:rFonts w:asciiTheme="minorHAnsi" w:hAnsiTheme="minorHAnsi" w:cstheme="minorHAnsi"/>
-                <w:sz w:val="12"/>
-                <w:szCs w:val="18"/>
-              </w:rPr>
-            </w:pPr>
+            <w:r/>
           </w:p>
         </w:tc>
         <w:tc>
@@ -4854,105 +4502,7 @@
             <w:vAlign w:val="center"/>
           </w:tcPr>
           <w:p>
-            <w:pPr>
-              <w:spacing w:before="120" w:after="120"/>
-              <w:rPr>
-                <w:rFonts w:asciiTheme="minorHAnsi" w:hAnsiTheme="minorHAnsi" w:cstheme="minorHAnsi"/>
-                <w:sz w:val="12"/>
-                <w:szCs w:val="18"/>
-              </w:rPr>
-            </w:pPr>
-            <w:r>
-              <w:rPr>
-                <w:rFonts w:cstheme="minorHAnsi"/>
-                <w:sz w:val="14"/>
-                <w:szCs w:val="18"/>
-              </w:rPr>
-              <w:fldChar w:fldCharType="begin">
-                <w:ffData>
-                  <w:name w:val="Text6"/>
-                  <w:enabled/>
-                  <w:calcOnExit w:val="0"/>
-                  <w:textInput/>
-                </w:ffData>
-              </w:fldChar>
-            </w:r>
-            <w:r>
-              <w:rPr>
-                <w:rFonts w:asciiTheme="minorHAnsi" w:hAnsiTheme="minorHAnsi" w:cstheme="minorHAnsi"/>
-                <w:sz w:val="14"/>
-                <w:szCs w:val="18"/>
-              </w:rPr>
-              <w:instrText xml:space="preserve"> FORMTEXT </w:instrText>
-            </w:r>
-            <w:r>
-              <w:rPr>
-                <w:rFonts w:cstheme="minorHAnsi"/>
-                <w:sz w:val="14"/>
-                <w:szCs w:val="18"/>
-              </w:rPr>
-            </w:r>
-            <w:r>
-              <w:rPr>
-                <w:rFonts w:cstheme="minorHAnsi"/>
-                <w:sz w:val="14"/>
-                <w:szCs w:val="18"/>
-              </w:rPr>
-              <w:fldChar w:fldCharType="separate"/>
-            </w:r>
-            <w:r>
-              <w:rPr>
-                <w:rFonts w:asciiTheme="minorHAnsi" w:hAnsiTheme="minorHAnsi" w:cstheme="minorHAnsi"/>
-                <w:noProof/>
-                <w:sz w:val="14"/>
-                <w:szCs w:val="18"/>
-              </w:rPr>
-              <w:t> </w:t>
-            </w:r>
-            <w:r>
-              <w:rPr>
-                <w:rFonts w:asciiTheme="minorHAnsi" w:hAnsiTheme="minorHAnsi" w:cstheme="minorHAnsi"/>
-                <w:noProof/>
-                <w:sz w:val="14"/>
-                <w:szCs w:val="18"/>
-              </w:rPr>
-              <w:t> </w:t>
-            </w:r>
-            <w:r>
-              <w:rPr>
-                <w:rFonts w:asciiTheme="minorHAnsi" w:hAnsiTheme="minorHAnsi" w:cstheme="minorHAnsi"/>
-                <w:noProof/>
-                <w:sz w:val="14"/>
-                <w:szCs w:val="18"/>
-              </w:rPr>
-              <w:t> </w:t>
-            </w:r>
-            <w:r>
-              <w:rPr>
-                <w:rFonts w:asciiTheme="minorHAnsi" w:hAnsiTheme="minorHAnsi" w:cstheme="minorHAnsi"/>
-                <w:noProof/>
-                <w:sz w:val="14"/>
-                <w:szCs w:val="18"/>
-              </w:rPr>
-              <w:t> </w:t>
-            </w:r>
-            <w:r>
-              <w:rPr>
-                <w:rFonts w:asciiTheme="minorHAnsi" w:hAnsiTheme="minorHAnsi" w:cstheme="minorHAnsi"/>
-                <w:noProof/>
-                <w:sz w:val="14"/>
-                <w:szCs w:val="18"/>
-              </w:rPr>
-              <w:t> </w:t>
-            </w:r>
-            <w:r>
-              <w:rPr>
-                <w:rFonts w:cstheme="minorHAnsi"/>
-                <w:sz w:val="14"/>
-                <w:szCs w:val="18"/>
-              </w:rPr>
-              <w:fldChar w:fldCharType="end"/>
-            </w:r>
+            <w:r/>
           </w:p>
         </w:tc>
       </w:tr>
@@ -4970,7 +4520,7 @@
     </w:p>
     <w:tbl>
       <w:tblPr>
-        <w:tblStyle w:val="TableGrid"/>
+        <w:tblStyle w:val="a6"/>
         <w:tblW w:w="11169" w:type="dxa"/>
         <w:tblInd w:w="-993" w:type="dxa"/>
         <w:tblBorders>
@@ -5051,114 +4601,7 @@
             <w:vAlign w:val="center"/>
           </w:tcPr>
           <w:p>
-            <w:pPr>
-              <w:keepLines/>
-              <w:spacing w:before="120" w:after="120"/>
-              <w:rPr>
-                <w:rFonts w:asciiTheme="minorHAnsi" w:hAnsiTheme="minorHAnsi" w:cstheme="minorHAnsi"/>
-                <w:sz w:val="14"/>
-                <w:szCs w:val="18"/>
-              </w:rPr>
-            </w:pPr>
-            <w:r>
-              <w:rPr>
-                <w:rFonts w:asciiTheme="minorHAnsi" w:hAnsiTheme="minorHAnsi" w:cstheme="minorHAnsi"/>
-                <w:sz w:val="16"/>
-                <w:szCs w:val="16"/>
-              </w:rPr>
-              <w:t xml:space="preserve"> </w:t>
-            </w:r>
-            <w:r>
-              <w:rPr>
-                <w:rFonts w:cstheme="minorHAnsi"/>
-                <w:sz w:val="14"/>
-                <w:szCs w:val="18"/>
-              </w:rPr>
-              <w:fldChar w:fldCharType="begin">
-                <w:ffData>
-                  <w:name w:val="Text6"/>
-                  <w:enabled/>
-                  <w:calcOnExit w:val="0"/>
-                  <w:textInput/>
-                </w:ffData>
-              </w:fldChar>
-            </w:r>
-            <w:r>
-              <w:rPr>
-                <w:rFonts w:asciiTheme="minorHAnsi" w:hAnsiTheme="minorHAnsi" w:cstheme="minorHAnsi"/>
-                <w:sz w:val="14"/>
-                <w:szCs w:val="18"/>
-              </w:rPr>
-              <w:instrText xml:space="preserve"> FORMTEXT </w:instrText>
-            </w:r>
-            <w:r>
-              <w:rPr>
-                <w:rFonts w:cstheme="minorHAnsi"/>
-                <w:sz w:val="14"/>
-                <w:szCs w:val="18"/>
-              </w:rPr>
-            </w:r>
-            <w:r>
-              <w:rPr>
-                <w:rFonts w:cstheme="minorHAnsi"/>
-                <w:sz w:val="14"/>
-                <w:szCs w:val="18"/>
-              </w:rPr>
-              <w:fldChar w:fldCharType="separate"/>
-            </w:r>
-            <w:r>
-              <w:rPr>
-                <w:rFonts w:asciiTheme="minorHAnsi" w:hAnsiTheme="minorHAnsi" w:cstheme="minorHAnsi"/>
-                <w:noProof/>
-                <w:sz w:val="14"/>
-                <w:szCs w:val="18"/>
-              </w:rPr>
-              <w:t> </w:t>
-            </w:r>
-            <w:r>
-              <w:rPr>
-                <w:rFonts w:asciiTheme="minorHAnsi" w:hAnsiTheme="minorHAnsi" w:cstheme="minorHAnsi"/>
-                <w:noProof/>
-                <w:sz w:val="14"/>
-                <w:szCs w:val="18"/>
-              </w:rPr>
-              <w:t> </w:t>
-            </w:r>
-            <w:r>
-              <w:rPr>
-                <w:rFonts w:asciiTheme="minorHAnsi" w:hAnsiTheme="minorHAnsi" w:cstheme="minorHAnsi"/>
-                <w:noProof/>
-                <w:sz w:val="14"/>
-                <w:szCs w:val="18"/>
-              </w:rPr>
-              <w:t> </w:t>
-            </w:r>
-            <w:r>
-              <w:rPr>
-                <w:rFonts w:asciiTheme="minorHAnsi" w:hAnsiTheme="minorHAnsi" w:cstheme="minorHAnsi"/>
-                <w:noProof/>
-                <w:sz w:val="14"/>
-                <w:szCs w:val="18"/>
-              </w:rPr>
-              <w:t> </w:t>
-            </w:r>
-            <w:r>
-              <w:rPr>
-                <w:rFonts w:asciiTheme="minorHAnsi" w:hAnsiTheme="minorHAnsi" w:cstheme="minorHAnsi"/>
-                <w:noProof/>
-                <w:sz w:val="14"/>
-                <w:szCs w:val="18"/>
-              </w:rPr>
-              <w:t> </w:t>
-            </w:r>
-            <w:r>
-              <w:rPr>
-                <w:rFonts w:cstheme="minorHAnsi"/>
-                <w:sz w:val="14"/>
-                <w:szCs w:val="18"/>
-              </w:rPr>
-              <w:fldChar w:fldCharType="end"/>
-            </w:r>
+            <w:r/>
           </w:p>
         </w:tc>
       </w:tr>
@@ -5224,107 +4667,7 @@
             <w:vAlign w:val="center"/>
           </w:tcPr>
           <w:p>
-            <w:pPr>
-              <w:keepLines/>
-              <w:spacing w:before="120" w:after="120"/>
-              <w:rPr>
-                <w:rFonts w:asciiTheme="minorHAnsi" w:hAnsiTheme="minorHAnsi" w:cstheme="minorHAnsi"/>
-                <w:color w:val="FF4500"/>
-                <w:sz w:val="12"/>
-                <w:szCs w:val="18"/>
-              </w:rPr>
-            </w:pPr>
-            <w:r>
-              <w:rPr>
-                <w:rFonts w:cstheme="minorHAnsi"/>
-                <w:sz w:val="14"/>
-                <w:szCs w:val="18"/>
-              </w:rPr>
-              <w:fldChar w:fldCharType="begin">
-                <w:ffData>
-                  <w:name w:val="Text6"/>
-                  <w:enabled/>
-                  <w:calcOnExit w:val="0"/>
-                  <w:textInput/>
-                </w:ffData>
-              </w:fldChar>
-            </w:r>
-            <w:r>
-              <w:rPr>
-                <w:rFonts w:asciiTheme="minorHAnsi" w:hAnsiTheme="minorHAnsi" w:cstheme="minorHAnsi"/>
-                <w:sz w:val="14"/>
-                <w:szCs w:val="18"/>
-              </w:rPr>
-              <w:instrText xml:space="preserve"> FORMTEXT </w:instrText>
-            </w:r>
-            <w:r>
-              <w:rPr>
-                <w:rFonts w:cstheme="minorHAnsi"/>
-                <w:sz w:val="14"/>
-                <w:szCs w:val="18"/>
-              </w:rPr>
-            </w:r>
-            <w:r>
-              <w:rPr>
-                <w:rFonts w:cstheme="minorHAnsi"/>
-                <w:sz w:val="14"/>
-                <w:szCs w:val="18"/>
-              </w:rPr>
-              <w:fldChar w:fldCharType="separate"/>
-            </w:r>
-            <w:r>
-              <w:rPr>
-                <w:rFonts w:asciiTheme="minorHAnsi" w:hAnsiTheme="minorHAnsi" w:cstheme="minorHAnsi"/>
-                <w:noProof/>
-                <w:sz w:val="14"/>
-                <w:szCs w:val="18"/>
-              </w:rPr>
-              <w:t> </w:t>
-            </w:r>
-            <w:r>
-              <w:rPr>
-                <w:rFonts w:asciiTheme="minorHAnsi" w:hAnsiTheme="minorHAnsi" w:cstheme="minorHAnsi"/>
-                <w:noProof/>
-                <w:sz w:val="14"/>
-                <w:szCs w:val="18"/>
-              </w:rPr>
-              <w:t> </w:t>
-            </w:r>
-            <w:r>
-              <w:rPr>
-                <w:rFonts w:asciiTheme="minorHAnsi" w:hAnsiTheme="minorHAnsi" w:cstheme="minorHAnsi"/>
-                <w:noProof/>
-                <w:sz w:val="14"/>
-                <w:szCs w:val="18"/>
-              </w:rPr>
-              <w:t> </w:t>
-            </w:r>
-            <w:r>
-              <w:rPr>
-                <w:rFonts w:asciiTheme="minorHAnsi" w:hAnsiTheme="minorHAnsi" w:cstheme="minorHAnsi"/>
-                <w:noProof/>
-                <w:sz w:val="14"/>
-                <w:szCs w:val="18"/>
-              </w:rPr>
-              <w:t> </w:t>
-            </w:r>
-            <w:r>
-              <w:rPr>
-                <w:rFonts w:asciiTheme="minorHAnsi" w:hAnsiTheme="minorHAnsi" w:cstheme="minorHAnsi"/>
-                <w:noProof/>
-                <w:sz w:val="14"/>
-                <w:szCs w:val="18"/>
-              </w:rPr>
-              <w:t> </w:t>
-            </w:r>
-            <w:r>
-              <w:rPr>
-                <w:rFonts w:cstheme="minorHAnsi"/>
-                <w:sz w:val="14"/>
-                <w:szCs w:val="18"/>
-              </w:rPr>
-              <w:fldChar w:fldCharType="end"/>
-            </w:r>
+            <w:r/>
           </w:p>
         </w:tc>
       </w:tr>
@@ -5375,7 +4718,27 @@
               <w:szCs w:val="15"/>
               <w:lang w:val="de-DE" w:eastAsia="en-GB"/>
             </w:rPr>
-            <w:t>Springer Nature Switzerland AG</w:t>
+            <w:t xml:space="preserve">Springer Nature </w:t>
+          </w:r>
+          <w:proofErr w:type="spellStart"/>
+          <w:r>
+            <w:rPr>
+              <w:rFonts w:eastAsia="Arial" w:cstheme="minorHAnsi"/>
+              <w:sz w:val="15"/>
+              <w:szCs w:val="15"/>
+              <w:lang w:val="de-DE" w:eastAsia="en-GB"/>
+            </w:rPr>
+            <w:t>Switzerland</w:t>
+          </w:r>
+          <w:proofErr w:type="spellEnd"/>
+          <w:r>
+            <w:rPr>
+              <w:rFonts w:eastAsia="Arial" w:cstheme="minorHAnsi"/>
+              <w:sz w:val="15"/>
+              <w:szCs w:val="15"/>
+              <w:lang w:val="de-DE" w:eastAsia="en-GB"/>
+            </w:rPr>
+            <w:t xml:space="preserve"> AG</w:t>
           </w:r>
         </w:sdtContent>
       </w:sdt>
@@ -5395,6 +4758,7 @@
           <w:id w:val="1720135088"/>
         </w:sdtPr>
         <w:sdtContent>
+          <w:proofErr w:type="spellStart"/>
           <w:r>
             <w:rPr>
               <w:rFonts w:eastAsia="Arial" w:cstheme="minorHAnsi"/>
@@ -5402,7 +4766,17 @@
               <w:szCs w:val="15"/>
               <w:lang w:val="de-DE" w:eastAsia="en-GB"/>
             </w:rPr>
-            <w:t>Gewerbestrasse 11, 6330 Cham, Switzerland</w:t>
+            <w:t>Gewerbestrasse</w:t>
+          </w:r>
+          <w:proofErr w:type="spellEnd"/>
+          <w:r>
+            <w:rPr>
+              <w:rFonts w:eastAsia="Arial" w:cstheme="minorHAnsi"/>
+              <w:sz w:val="15"/>
+              <w:szCs w:val="15"/>
+              <w:lang w:val="de-DE" w:eastAsia="en-GB"/>
+            </w:rPr>
+            <w:t xml:space="preserve"> 11, 6330 Cham, Switzerland</w:t>
           </w:r>
         </w:sdtContent>
       </w:sdt>
@@ -5432,7 +4806,6 @@
           <w:szCs w:val="15"/>
           <w:lang w:eastAsia="en-GB"/>
         </w:rPr>
-        <w:lastRenderedPageBreak/>
         <w:t>ER_Book_ProceedingsPaper_LTP_</w:t>
       </w:r>
       <w:sdt>
@@ -5483,7 +4856,7 @@
     </w:p>
     <w:p>
       <w:pPr>
-        <w:pStyle w:val="NormalWeb"/>
+        <w:pStyle w:val="ae"/>
         <w:spacing w:before="0" w:beforeAutospacing="0" w:after="0" w:afterAutospacing="0"/>
         <w:rPr>
           <w:rFonts w:asciiTheme="minorHAnsi" w:hAnsiTheme="minorHAnsi" w:cstheme="minorHAnsi"/>
@@ -5601,7 +4974,7 @@
     </w:p>
     <w:p>
       <w:pPr>
-        <w:pStyle w:val="NormalWeb"/>
+        <w:pStyle w:val="ae"/>
         <w:spacing w:before="0" w:beforeAutospacing="0" w:after="0" w:afterAutospacing="0"/>
         <w:rPr>
           <w:rFonts w:asciiTheme="minorHAnsi" w:hAnsiTheme="minorHAnsi" w:cstheme="minorHAnsi"/>
@@ -5710,12 +5083,12 @@
       </w:r>
     </w:p>
     <w:sectPr>
-      <w:headerReference w:type="even" r:id="rId16"/>
-      <w:headerReference w:type="default" r:id="rId17"/>
-      <w:footerReference w:type="even" r:id="rId18"/>
-      <w:footerReference w:type="default" r:id="rId19"/>
-      <w:headerReference w:type="first" r:id="rId20"/>
-      <w:footerReference w:type="first" r:id="rId21"/>
+      <w:headerReference w:type="even" r:id="rId17"/>
+      <w:headerReference w:type="default" r:id="rId18"/>
+      <w:footerReference w:type="even" r:id="rId19"/>
+      <w:footerReference w:type="default" r:id="rId20"/>
+      <w:headerReference w:type="first" r:id="rId21"/>
+      <w:footerReference w:type="first" r:id="rId22"/>
       <w:type w:val="continuous"/>
       <w:pgSz w:w="11909" w:h="16834"/>
       <w:pgMar w:top="1440" w:right="1440" w:bottom="1440" w:left="1440" w:header="720" w:footer="720" w:gutter="0"/>
@@ -5727,7 +5100,7 @@
 </file>
 
 <file path=word/endnotes.xml><?xml version="1.0" encoding="utf-8"?>
-<w:endnotes xmlns:wpc="http://schemas.microsoft.com/office/word/2010/wordprocessingCanvas" xmlns:cx="http://schemas.microsoft.com/office/drawing/2014/chartex" xmlns:cx1="http://schemas.microsoft.com/office/drawing/2015/9/8/chartex" xmlns:cx2="http://schemas.microsoft.com/office/drawing/2015/10/21/chartex" xmlns:cx3="http://schemas.microsoft.com/office/drawing/2016/5/9/chartex" xmlns:cx4="http://schemas.microsoft.com/office/drawing/2016/5/10/chartex" xmlns:cx5="http://schemas.microsoft.com/office/drawing/2016/5/11/chartex" xmlns:cx6="http://schemas.microsoft.com/office/drawing/2016/5/12/chartex" xmlns:cx7="http://schemas.microsoft.com/office/drawing/2016/5/13/chartex" xmlns:cx8="http://schemas.microsoft.com/office/drawing/2016/5/14/chartex" xmlns:mc="http://schemas.openxmlformats.org/markup-compatibility/2006" xmlns:aink="http://schemas.microsoft.com/office/drawing/2016/ink" xmlns:am3d="http://schemas.microsoft.com/office/drawing/2017/model3d" xmlns:o="urn:schemas-microsoft-com:office:office" xmlns:oel="http://schemas.microsoft.com/office/2019/extlst" xmlns:r="http://schemas.openxmlformats.org/officeDocument/2006/relationships" xmlns:m="http://schemas.openxmlformats.org/officeDocument/2006/math" xmlns:v="urn:schemas-microsoft-com:vml" xmlns:wp14="http://schemas.microsoft.com/office/word/2010/wordprocessingDrawing" xmlns:wp="http://schemas.openxmlformats.org/drawingml/2006/wordprocessingDrawing" xmlns:w10="urn:schemas-microsoft-com:office:word" xmlns:w="http://schemas.openxmlformats.org/wordprocessingml/2006/main" xmlns:w14="http://schemas.microsoft.com/office/word/2010/wordml" xmlns:w15="http://schemas.microsoft.com/office/word/2012/wordml" xmlns:w16cex="http://schemas.microsoft.com/office/word/2018/wordml/cex" xmlns:w16cid="http://schemas.microsoft.com/office/word/2016/wordml/cid" xmlns:w16="http://schemas.microsoft.com/office/word/2018/wordml" xmlns:w16du="http://schemas.microsoft.com/office/word/2023/wordml/word16du" xmlns:w16sdtdh="http://schemas.microsoft.com/office/word/2020/wordml/sdtdatahash" xmlns:w16sdtfl="http://schemas.microsoft.com/office/word/2024/wordml/sdtformatlock" xmlns:w16se="http://schemas.microsoft.com/office/word/2015/wordml/symex" xmlns:wpg="http://schemas.microsoft.com/office/word/2010/wordprocessingGroup" xmlns:wpi="http://schemas.microsoft.com/office/word/2010/wordprocessingInk" xmlns:wne="http://schemas.microsoft.com/office/word/2006/wordml" xmlns:wps="http://schemas.microsoft.com/office/word/2010/wordprocessingShape" mc:Ignorable="w14 w15 w16se w16cid w16 w16cex w16sdtdh w16sdtfl w16du wp14">
+<w:endnotes xmlns:wpc="http://schemas.microsoft.com/office/word/2010/wordprocessingCanvas" xmlns:cx="http://schemas.microsoft.com/office/drawing/2014/chartex" xmlns:cx1="http://schemas.microsoft.com/office/drawing/2015/9/8/chartex" xmlns:cx2="http://schemas.microsoft.com/office/drawing/2015/10/21/chartex" xmlns:cx3="http://schemas.microsoft.com/office/drawing/2016/5/9/chartex" xmlns:cx4="http://schemas.microsoft.com/office/drawing/2016/5/10/chartex" xmlns:cx5="http://schemas.microsoft.com/office/drawing/2016/5/11/chartex" xmlns:cx6="http://schemas.microsoft.com/office/drawing/2016/5/12/chartex" xmlns:cx7="http://schemas.microsoft.com/office/drawing/2016/5/13/chartex" xmlns:cx8="http://schemas.microsoft.com/office/drawing/2016/5/14/chartex" xmlns:mc="http://schemas.openxmlformats.org/markup-compatibility/2006" xmlns:aink="http://schemas.microsoft.com/office/drawing/2016/ink" xmlns:am3d="http://schemas.microsoft.com/office/drawing/2017/model3d" xmlns:o="urn:schemas-microsoft-com:office:office" xmlns:oel="http://schemas.microsoft.com/office/2019/extlst" xmlns:r="http://schemas.openxmlformats.org/officeDocument/2006/relationships" xmlns:m="http://schemas.openxmlformats.org/officeDocument/2006/math" xmlns:v="urn:schemas-microsoft-com:vml" xmlns:wp14="http://schemas.microsoft.com/office/word/2010/wordprocessingDrawing" xmlns:wp="http://schemas.openxmlformats.org/drawingml/2006/wordprocessingDrawing" xmlns:w10="urn:schemas-microsoft-com:office:word" xmlns:w="http://schemas.openxmlformats.org/wordprocessingml/2006/main" xmlns:w14="http://schemas.microsoft.com/office/word/2010/wordml" xmlns:w15="http://schemas.microsoft.com/office/word/2012/wordml" xmlns:w16cei="http://schemas.microsoft.com/office/word/2026/wordml/cei" xmlns:w16cex="http://schemas.microsoft.com/office/word/2018/wordml/cex" xmlns:w16cid="http://schemas.microsoft.com/office/word/2016/wordml/cid" xmlns:w16="http://schemas.microsoft.com/office/word/2018/wordml" xmlns:w16du="http://schemas.microsoft.com/office/word/2023/wordml/word16du" xmlns:w16sdtdh="http://schemas.microsoft.com/office/word/2020/wordml/sdtdatahash" xmlns:w16sdtfl="http://schemas.microsoft.com/office/word/2024/wordml/sdtformatlock" xmlns:w16se="http://schemas.microsoft.com/office/word/2015/wordml/symex" xmlns:wpg="http://schemas.microsoft.com/office/word/2010/wordprocessingGroup" xmlns:wpi="http://schemas.microsoft.com/office/word/2010/wordprocessingInk" xmlns:wne="http://schemas.microsoft.com/office/word/2006/wordml" xmlns:wps="http://schemas.microsoft.com/office/word/2010/wordprocessingShape" mc:Ignorable="w14 w15 w16se w16cid w16 w16cex w16sdtdh w16sdtfl w16du wp14">
   <w:endnote w:type="separator" w:id="-1">
     <w:p>
       <w:pPr>
@@ -5752,17 +5125,17 @@
 </file>
 
 <file path=word/footer1.xml><?xml version="1.0" encoding="utf-8"?>
-<w:ftr xmlns:wpc="http://schemas.microsoft.com/office/word/2010/wordprocessingCanvas" xmlns:cx="http://schemas.microsoft.com/office/drawing/2014/chartex" xmlns:cx1="http://schemas.microsoft.com/office/drawing/2015/9/8/chartex" xmlns:cx2="http://schemas.microsoft.com/office/drawing/2015/10/21/chartex" xmlns:cx3="http://schemas.microsoft.com/office/drawing/2016/5/9/chartex" xmlns:cx4="http://schemas.microsoft.com/office/drawing/2016/5/10/chartex" xmlns:cx5="http://schemas.microsoft.com/office/drawing/2016/5/11/chartex" xmlns:cx6="http://schemas.microsoft.com/office/drawing/2016/5/12/chartex" xmlns:cx7="http://schemas.microsoft.com/office/drawing/2016/5/13/chartex" xmlns:cx8="http://schemas.microsoft.com/office/drawing/2016/5/14/chartex" xmlns:mc="http://schemas.openxmlformats.org/markup-compatibility/2006" xmlns:aink="http://schemas.microsoft.com/office/drawing/2016/ink" xmlns:am3d="http://schemas.microsoft.com/office/drawing/2017/model3d" xmlns:o="urn:schemas-microsoft-com:office:office" xmlns:oel="http://schemas.microsoft.com/office/2019/extlst" xmlns:r="http://schemas.openxmlformats.org/officeDocument/2006/relationships" xmlns:m="http://schemas.openxmlformats.org/officeDocument/2006/math" xmlns:v="urn:schemas-microsoft-com:vml" xmlns:wp14="http://schemas.microsoft.com/office/word/2010/wordprocessingDrawing" xmlns:wp="http://schemas.openxmlformats.org/drawingml/2006/wordprocessingDrawing" xmlns:w10="urn:schemas-microsoft-com:office:word" xmlns:w="http://schemas.openxmlformats.org/wordprocessingml/2006/main" xmlns:w14="http://schemas.microsoft.com/office/word/2010/wordml" xmlns:w15="http://schemas.microsoft.com/office/word/2012/wordml" xmlns:w16cex="http://schemas.microsoft.com/office/word/2018/wordml/cex" xmlns:w16cid="http://schemas.microsoft.com/office/word/2016/wordml/cid" xmlns:w16="http://schemas.microsoft.com/office/word/2018/wordml" xmlns:w16du="http://schemas.microsoft.com/office/word/2023/wordml/word16du" xmlns:w16sdtdh="http://schemas.microsoft.com/office/word/2020/wordml/sdtdatahash" xmlns:w16sdtfl="http://schemas.microsoft.com/office/word/2024/wordml/sdtformatlock" xmlns:w16se="http://schemas.microsoft.com/office/word/2015/wordml/symex" xmlns:wpg="http://schemas.microsoft.com/office/word/2010/wordprocessingGroup" xmlns:wpi="http://schemas.microsoft.com/office/word/2010/wordprocessingInk" xmlns:wne="http://schemas.microsoft.com/office/word/2006/wordml" xmlns:wps="http://schemas.microsoft.com/office/word/2010/wordprocessingShape" mc:Ignorable="w14 w15 w16se w16cid w16 w16cex w16sdtdh w16sdtfl w16du wp14">
+<w:ftr xmlns:wpc="http://schemas.microsoft.com/office/word/2010/wordprocessingCanvas" xmlns:cx="http://schemas.microsoft.com/office/drawing/2014/chartex" xmlns:cx1="http://schemas.microsoft.com/office/drawing/2015/9/8/chartex" xmlns:cx2="http://schemas.microsoft.com/office/drawing/2015/10/21/chartex" xmlns:cx3="http://schemas.microsoft.com/office/drawing/2016/5/9/chartex" xmlns:cx4="http://schemas.microsoft.com/office/drawing/2016/5/10/chartex" xmlns:cx5="http://schemas.microsoft.com/office/drawing/2016/5/11/chartex" xmlns:cx6="http://schemas.microsoft.com/office/drawing/2016/5/12/chartex" xmlns:cx7="http://schemas.microsoft.com/office/drawing/2016/5/13/chartex" xmlns:cx8="http://schemas.microsoft.com/office/drawing/2016/5/14/chartex" xmlns:mc="http://schemas.openxmlformats.org/markup-compatibility/2006" xmlns:aink="http://schemas.microsoft.com/office/drawing/2016/ink" xmlns:am3d="http://schemas.microsoft.com/office/drawing/2017/model3d" xmlns:o="urn:schemas-microsoft-com:office:office" xmlns:oel="http://schemas.microsoft.com/office/2019/extlst" xmlns:r="http://schemas.openxmlformats.org/officeDocument/2006/relationships" xmlns:m="http://schemas.openxmlformats.org/officeDocument/2006/math" xmlns:v="urn:schemas-microsoft-com:vml" xmlns:wp14="http://schemas.microsoft.com/office/word/2010/wordprocessingDrawing" xmlns:wp="http://schemas.openxmlformats.org/drawingml/2006/wordprocessingDrawing" xmlns:w10="urn:schemas-microsoft-com:office:word" xmlns:w="http://schemas.openxmlformats.org/wordprocessingml/2006/main" xmlns:w14="http://schemas.microsoft.com/office/word/2010/wordml" xmlns:w15="http://schemas.microsoft.com/office/word/2012/wordml" xmlns:w16cei="http://schemas.microsoft.com/office/word/2026/wordml/cei" xmlns:w16cex="http://schemas.microsoft.com/office/word/2018/wordml/cex" xmlns:w16cid="http://schemas.microsoft.com/office/word/2016/wordml/cid" xmlns:w16="http://schemas.microsoft.com/office/word/2018/wordml" xmlns:w16du="http://schemas.microsoft.com/office/word/2023/wordml/word16du" xmlns:w16sdtdh="http://schemas.microsoft.com/office/word/2020/wordml/sdtdatahash" xmlns:w16sdtfl="http://schemas.microsoft.com/office/word/2024/wordml/sdtformatlock" xmlns:w16se="http://schemas.microsoft.com/office/word/2015/wordml/symex" xmlns:wpg="http://schemas.microsoft.com/office/word/2010/wordprocessingGroup" xmlns:wpi="http://schemas.microsoft.com/office/word/2010/wordprocessingInk" xmlns:wne="http://schemas.microsoft.com/office/word/2006/wordml" xmlns:wps="http://schemas.microsoft.com/office/word/2010/wordprocessingShape" mc:Ignorable="w14 w15 w16se w16cid w16 w16cex w16sdtdh w16sdtfl w16du wp14">
   <w:p>
     <w:pPr>
-      <w:pStyle w:val="Footer"/>
+      <w:pStyle w:val="a9"/>
     </w:pPr>
   </w:p>
 </w:ftr>
 </file>
 
 <file path=word/footer2.xml><?xml version="1.0" encoding="utf-8"?>
-<w:ftr xmlns:wpc="http://schemas.microsoft.com/office/word/2010/wordprocessingCanvas" xmlns:cx="http://schemas.microsoft.com/office/drawing/2014/chartex" xmlns:cx1="http://schemas.microsoft.com/office/drawing/2015/9/8/chartex" xmlns:cx2="http://schemas.microsoft.com/office/drawing/2015/10/21/chartex" xmlns:cx3="http://schemas.microsoft.com/office/drawing/2016/5/9/chartex" xmlns:cx4="http://schemas.microsoft.com/office/drawing/2016/5/10/chartex" xmlns:cx5="http://schemas.microsoft.com/office/drawing/2016/5/11/chartex" xmlns:cx6="http://schemas.microsoft.com/office/drawing/2016/5/12/chartex" xmlns:cx7="http://schemas.microsoft.com/office/drawing/2016/5/13/chartex" xmlns:cx8="http://schemas.microsoft.com/office/drawing/2016/5/14/chartex" xmlns:mc="http://schemas.openxmlformats.org/markup-compatibility/2006" xmlns:aink="http://schemas.microsoft.com/office/drawing/2016/ink" xmlns:am3d="http://schemas.microsoft.com/office/drawing/2017/model3d" xmlns:o="urn:schemas-microsoft-com:office:office" xmlns:oel="http://schemas.microsoft.com/office/2019/extlst" xmlns:r="http://schemas.openxmlformats.org/officeDocument/2006/relationships" xmlns:m="http://schemas.openxmlformats.org/officeDocument/2006/math" xmlns:v="urn:schemas-microsoft-com:vml" xmlns:wp14="http://schemas.microsoft.com/office/word/2010/wordprocessingDrawing" xmlns:wp="http://schemas.openxmlformats.org/drawingml/2006/wordprocessingDrawing" xmlns:w10="urn:schemas-microsoft-com:office:word" xmlns:w="http://schemas.openxmlformats.org/wordprocessingml/2006/main" xmlns:w14="http://schemas.microsoft.com/office/word/2010/wordml" xmlns:w15="http://schemas.microsoft.com/office/word/2012/wordml" xmlns:w16cex="http://schemas.microsoft.com/office/word/2018/wordml/cex" xmlns:w16cid="http://schemas.microsoft.com/office/word/2016/wordml/cid" xmlns:w16="http://schemas.microsoft.com/office/word/2018/wordml" xmlns:w16du="http://schemas.microsoft.com/office/word/2023/wordml/word16du" xmlns:w16sdtdh="http://schemas.microsoft.com/office/word/2020/wordml/sdtdatahash" xmlns:w16sdtfl="http://schemas.microsoft.com/office/word/2024/wordml/sdtformatlock" xmlns:w16se="http://schemas.microsoft.com/office/word/2015/wordml/symex" xmlns:wpg="http://schemas.microsoft.com/office/word/2010/wordprocessingGroup" xmlns:wpi="http://schemas.microsoft.com/office/word/2010/wordprocessingInk" xmlns:wne="http://schemas.microsoft.com/office/word/2006/wordml" xmlns:wps="http://schemas.microsoft.com/office/word/2010/wordprocessingShape" mc:Ignorable="w14 w15 w16se w16cid w16 w16cex w16sdtdh w16sdtfl w16du wp14">
+<w:ftr xmlns:wpc="http://schemas.microsoft.com/office/word/2010/wordprocessingCanvas" xmlns:cx="http://schemas.microsoft.com/office/drawing/2014/chartex" xmlns:cx1="http://schemas.microsoft.com/office/drawing/2015/9/8/chartex" xmlns:cx2="http://schemas.microsoft.com/office/drawing/2015/10/21/chartex" xmlns:cx3="http://schemas.microsoft.com/office/drawing/2016/5/9/chartex" xmlns:cx4="http://schemas.microsoft.com/office/drawing/2016/5/10/chartex" xmlns:cx5="http://schemas.microsoft.com/office/drawing/2016/5/11/chartex" xmlns:cx6="http://schemas.microsoft.com/office/drawing/2016/5/12/chartex" xmlns:cx7="http://schemas.microsoft.com/office/drawing/2016/5/13/chartex" xmlns:cx8="http://schemas.microsoft.com/office/drawing/2016/5/14/chartex" xmlns:mc="http://schemas.openxmlformats.org/markup-compatibility/2006" xmlns:aink="http://schemas.microsoft.com/office/drawing/2016/ink" xmlns:am3d="http://schemas.microsoft.com/office/drawing/2017/model3d" xmlns:o="urn:schemas-microsoft-com:office:office" xmlns:oel="http://schemas.microsoft.com/office/2019/extlst" xmlns:r="http://schemas.openxmlformats.org/officeDocument/2006/relationships" xmlns:m="http://schemas.openxmlformats.org/officeDocument/2006/math" xmlns:v="urn:schemas-microsoft-com:vml" xmlns:wp14="http://schemas.microsoft.com/office/word/2010/wordprocessingDrawing" xmlns:wp="http://schemas.openxmlformats.org/drawingml/2006/wordprocessingDrawing" xmlns:w10="urn:schemas-microsoft-com:office:word" xmlns:w="http://schemas.openxmlformats.org/wordprocessingml/2006/main" xmlns:w14="http://schemas.microsoft.com/office/word/2010/wordml" xmlns:w15="http://schemas.microsoft.com/office/word/2012/wordml" xmlns:w16cei="http://schemas.microsoft.com/office/word/2026/wordml/cei" xmlns:w16cex="http://schemas.microsoft.com/office/word/2018/wordml/cex" xmlns:w16cid="http://schemas.microsoft.com/office/word/2016/wordml/cid" xmlns:w16="http://schemas.microsoft.com/office/word/2018/wordml" xmlns:w16du="http://schemas.microsoft.com/office/word/2023/wordml/word16du" xmlns:w16sdtdh="http://schemas.microsoft.com/office/word/2020/wordml/sdtdatahash" xmlns:w16sdtfl="http://schemas.microsoft.com/office/word/2024/wordml/sdtformatlock" xmlns:w16se="http://schemas.microsoft.com/office/word/2015/wordml/symex" xmlns:wpg="http://schemas.microsoft.com/office/word/2010/wordprocessingGroup" xmlns:wpi="http://schemas.microsoft.com/office/word/2010/wordprocessingInk" xmlns:wne="http://schemas.microsoft.com/office/word/2006/wordml" xmlns:wps="http://schemas.microsoft.com/office/word/2010/wordprocessingShape" mc:Ignorable="w14 w15 w16se w16cid w16 w16cex w16sdtdh w16sdtfl w16du wp14">
   <w:sdt>
     <w:sdtPr>
       <w:rPr>
@@ -5791,7 +5164,7 @@
         <w:sdtContent>
           <w:p>
             <w:pPr>
-              <w:pStyle w:val="Footer"/>
+              <w:pStyle w:val="a9"/>
               <w:jc w:val="right"/>
               <w:rPr>
                 <w:sz w:val="16"/>
@@ -5911,24 +5284,24 @@
   </w:sdt>
   <w:p>
     <w:pPr>
-      <w:pStyle w:val="Footer"/>
+      <w:pStyle w:val="a9"/>
     </w:pPr>
   </w:p>
 </w:ftr>
 </file>
 
 <file path=word/footer3.xml><?xml version="1.0" encoding="utf-8"?>
-<w:ftr xmlns:wpc="http://schemas.microsoft.com/office/word/2010/wordprocessingCanvas" xmlns:cx="http://schemas.microsoft.com/office/drawing/2014/chartex" xmlns:cx1="http://schemas.microsoft.com/office/drawing/2015/9/8/chartex" xmlns:cx2="http://schemas.microsoft.com/office/drawing/2015/10/21/chartex" xmlns:cx3="http://schemas.microsoft.com/office/drawing/2016/5/9/chartex" xmlns:cx4="http://schemas.microsoft.com/office/drawing/2016/5/10/chartex" xmlns:cx5="http://schemas.microsoft.com/office/drawing/2016/5/11/chartex" xmlns:cx6="http://schemas.microsoft.com/office/drawing/2016/5/12/chartex" xmlns:cx7="http://schemas.microsoft.com/office/drawing/2016/5/13/chartex" xmlns:cx8="http://schemas.microsoft.com/office/drawing/2016/5/14/chartex" xmlns:mc="http://schemas.openxmlformats.org/markup-compatibility/2006" xmlns:aink="http://schemas.microsoft.com/office/drawing/2016/ink" xmlns:am3d="http://schemas.microsoft.com/office/drawing/2017/model3d" xmlns:o="urn:schemas-microsoft-com:office:office" xmlns:oel="http://schemas.microsoft.com/office/2019/extlst" xmlns:r="http://schemas.openxmlformats.org/officeDocument/2006/relationships" xmlns:m="http://schemas.openxmlformats.org/officeDocument/2006/math" xmlns:v="urn:schemas-microsoft-com:vml" xmlns:wp14="http://schemas.microsoft.com/office/word/2010/wordprocessingDrawing" xmlns:wp="http://schemas.openxmlformats.org/drawingml/2006/wordprocessingDrawing" xmlns:w10="urn:schemas-microsoft-com:office:word" xmlns:w="http://schemas.openxmlformats.org/wordprocessingml/2006/main" xmlns:w14="http://schemas.microsoft.com/office/word/2010/wordml" xmlns:w15="http://schemas.microsoft.com/office/word/2012/wordml" xmlns:w16cex="http://schemas.microsoft.com/office/word/2018/wordml/cex" xmlns:w16cid="http://schemas.microsoft.com/office/word/2016/wordml/cid" xmlns:w16="http://schemas.microsoft.com/office/word/2018/wordml" xmlns:w16du="http://schemas.microsoft.com/office/word/2023/wordml/word16du" xmlns:w16sdtdh="http://schemas.microsoft.com/office/word/2020/wordml/sdtdatahash" xmlns:w16sdtfl="http://schemas.microsoft.com/office/word/2024/wordml/sdtformatlock" xmlns:w16se="http://schemas.microsoft.com/office/word/2015/wordml/symex" xmlns:wpg="http://schemas.microsoft.com/office/word/2010/wordprocessingGroup" xmlns:wpi="http://schemas.microsoft.com/office/word/2010/wordprocessingInk" xmlns:wne="http://schemas.microsoft.com/office/word/2006/wordml" xmlns:wps="http://schemas.microsoft.com/office/word/2010/wordprocessingShape" mc:Ignorable="w14 w15 w16se w16cid w16 w16cex w16sdtdh w16sdtfl w16du wp14">
+<w:ftr xmlns:wpc="http://schemas.microsoft.com/office/word/2010/wordprocessingCanvas" xmlns:cx="http://schemas.microsoft.com/office/drawing/2014/chartex" xmlns:cx1="http://schemas.microsoft.com/office/drawing/2015/9/8/chartex" xmlns:cx2="http://schemas.microsoft.com/office/drawing/2015/10/21/chartex" xmlns:cx3="http://schemas.microsoft.com/office/drawing/2016/5/9/chartex" xmlns:cx4="http://schemas.microsoft.com/office/drawing/2016/5/10/chartex" xmlns:cx5="http://schemas.microsoft.com/office/drawing/2016/5/11/chartex" xmlns:cx6="http://schemas.microsoft.com/office/drawing/2016/5/12/chartex" xmlns:cx7="http://schemas.microsoft.com/office/drawing/2016/5/13/chartex" xmlns:cx8="http://schemas.microsoft.com/office/drawing/2016/5/14/chartex" xmlns:mc="http://schemas.openxmlformats.org/markup-compatibility/2006" xmlns:aink="http://schemas.microsoft.com/office/drawing/2016/ink" xmlns:am3d="http://schemas.microsoft.com/office/drawing/2017/model3d" xmlns:o="urn:schemas-microsoft-com:office:office" xmlns:oel="http://schemas.microsoft.com/office/2019/extlst" xmlns:r="http://schemas.openxmlformats.org/officeDocument/2006/relationships" xmlns:m="http://schemas.openxmlformats.org/officeDocument/2006/math" xmlns:v="urn:schemas-microsoft-com:vml" xmlns:wp14="http://schemas.microsoft.com/office/word/2010/wordprocessingDrawing" xmlns:wp="http://schemas.openxmlformats.org/drawingml/2006/wordprocessingDrawing" xmlns:w10="urn:schemas-microsoft-com:office:word" xmlns:w="http://schemas.openxmlformats.org/wordprocessingml/2006/main" xmlns:w14="http://schemas.microsoft.com/office/word/2010/wordml" xmlns:w15="http://schemas.microsoft.com/office/word/2012/wordml" xmlns:w16cei="http://schemas.microsoft.com/office/word/2026/wordml/cei" xmlns:w16cex="http://schemas.microsoft.com/office/word/2018/wordml/cex" xmlns:w16cid="http://schemas.microsoft.com/office/word/2016/wordml/cid" xmlns:w16="http://schemas.microsoft.com/office/word/2018/wordml" xmlns:w16du="http://schemas.microsoft.com/office/word/2023/wordml/word16du" xmlns:w16sdtdh="http://schemas.microsoft.com/office/word/2020/wordml/sdtdatahash" xmlns:w16sdtfl="http://schemas.microsoft.com/office/word/2024/wordml/sdtformatlock" xmlns:w16se="http://schemas.microsoft.com/office/word/2015/wordml/symex" xmlns:wpg="http://schemas.microsoft.com/office/word/2010/wordprocessingGroup" xmlns:wpi="http://schemas.microsoft.com/office/word/2010/wordprocessingInk" xmlns:wne="http://schemas.microsoft.com/office/word/2006/wordml" xmlns:wps="http://schemas.microsoft.com/office/word/2010/wordprocessingShape" mc:Ignorable="w14 w15 w16se w16cid w16 w16cex w16sdtdh w16sdtfl w16du wp14">
   <w:p>
     <w:pPr>
-      <w:pStyle w:val="Footer"/>
+      <w:pStyle w:val="a9"/>
     </w:pPr>
   </w:p>
 </w:ftr>
 </file>
 
 <file path=word/footnotes.xml><?xml version="1.0" encoding="utf-8"?>
-<w:footnotes xmlns:wpc="http://schemas.microsoft.com/office/word/2010/wordprocessingCanvas" xmlns:cx="http://schemas.microsoft.com/office/drawing/2014/chartex" xmlns:cx1="http://schemas.microsoft.com/office/drawing/2015/9/8/chartex" xmlns:cx2="http://schemas.microsoft.com/office/drawing/2015/10/21/chartex" xmlns:cx3="http://schemas.microsoft.com/office/drawing/2016/5/9/chartex" xmlns:cx4="http://schemas.microsoft.com/office/drawing/2016/5/10/chartex" xmlns:cx5="http://schemas.microsoft.com/office/drawing/2016/5/11/chartex" xmlns:cx6="http://schemas.microsoft.com/office/drawing/2016/5/12/chartex" xmlns:cx7="http://schemas.microsoft.com/office/drawing/2016/5/13/chartex" xmlns:cx8="http://schemas.microsoft.com/office/drawing/2016/5/14/chartex" xmlns:mc="http://schemas.openxmlformats.org/markup-compatibility/2006" xmlns:aink="http://schemas.microsoft.com/office/drawing/2016/ink" xmlns:am3d="http://schemas.microsoft.com/office/drawing/2017/model3d" xmlns:o="urn:schemas-microsoft-com:office:office" xmlns:oel="http://schemas.microsoft.com/office/2019/extlst" xmlns:r="http://schemas.openxmlformats.org/officeDocument/2006/relationships" xmlns:m="http://schemas.openxmlformats.org/officeDocument/2006/math" xmlns:v="urn:schemas-microsoft-com:vml" xmlns:wp14="http://schemas.microsoft.com/office/word/2010/wordprocessingDrawing" xmlns:wp="http://schemas.openxmlformats.org/drawingml/2006/wordprocessingDrawing" xmlns:w10="urn:schemas-microsoft-com:office:word" xmlns:w="http://schemas.openxmlformats.org/wordprocessingml/2006/main" xmlns:w14="http://schemas.microsoft.com/office/word/2010/wordml" xmlns:w15="http://schemas.microsoft.com/office/word/2012/wordml" xmlns:w16cex="http://schemas.microsoft.com/office/word/2018/wordml/cex" xmlns:w16cid="http://schemas.microsoft.com/office/word/2016/wordml/cid" xmlns:w16="http://schemas.microsoft.com/office/word/2018/wordml" xmlns:w16du="http://schemas.microsoft.com/office/word/2023/wordml/word16du" xmlns:w16sdtdh="http://schemas.microsoft.com/office/word/2020/wordml/sdtdatahash" xmlns:w16sdtfl="http://schemas.microsoft.com/office/word/2024/wordml/sdtformatlock" xmlns:w16se="http://schemas.microsoft.com/office/word/2015/wordml/symex" xmlns:wpg="http://schemas.microsoft.com/office/word/2010/wordprocessingGroup" xmlns:wpi="http://schemas.microsoft.com/office/word/2010/wordprocessingInk" xmlns:wne="http://schemas.microsoft.com/office/word/2006/wordml" xmlns:wps="http://schemas.microsoft.com/office/word/2010/wordprocessingShape" mc:Ignorable="w14 w15 w16se w16cid w16 w16cex w16sdtdh w16sdtfl w16du wp14">
+<w:footnotes xmlns:wpc="http://schemas.microsoft.com/office/word/2010/wordprocessingCanvas" xmlns:cx="http://schemas.microsoft.com/office/drawing/2014/chartex" xmlns:cx1="http://schemas.microsoft.com/office/drawing/2015/9/8/chartex" xmlns:cx2="http://schemas.microsoft.com/office/drawing/2015/10/21/chartex" xmlns:cx3="http://schemas.microsoft.com/office/drawing/2016/5/9/chartex" xmlns:cx4="http://schemas.microsoft.com/office/drawing/2016/5/10/chartex" xmlns:cx5="http://schemas.microsoft.com/office/drawing/2016/5/11/chartex" xmlns:cx6="http://schemas.microsoft.com/office/drawing/2016/5/12/chartex" xmlns:cx7="http://schemas.microsoft.com/office/drawing/2016/5/13/chartex" xmlns:cx8="http://schemas.microsoft.com/office/drawing/2016/5/14/chartex" xmlns:mc="http://schemas.openxmlformats.org/markup-compatibility/2006" xmlns:aink="http://schemas.microsoft.com/office/drawing/2016/ink" xmlns:am3d="http://schemas.microsoft.com/office/drawing/2017/model3d" xmlns:o="urn:schemas-microsoft-com:office:office" xmlns:oel="http://schemas.microsoft.com/office/2019/extlst" xmlns:r="http://schemas.openxmlformats.org/officeDocument/2006/relationships" xmlns:m="http://schemas.openxmlformats.org/officeDocument/2006/math" xmlns:v="urn:schemas-microsoft-com:vml" xmlns:wp14="http://schemas.microsoft.com/office/word/2010/wordprocessingDrawing" xmlns:wp="http://schemas.openxmlformats.org/drawingml/2006/wordprocessingDrawing" xmlns:w10="urn:schemas-microsoft-com:office:word" xmlns:w="http://schemas.openxmlformats.org/wordprocessingml/2006/main" xmlns:w14="http://schemas.microsoft.com/office/word/2010/wordml" xmlns:w15="http://schemas.microsoft.com/office/word/2012/wordml" xmlns:w16cei="http://schemas.microsoft.com/office/word/2026/wordml/cei" xmlns:w16cex="http://schemas.microsoft.com/office/word/2018/wordml/cex" xmlns:w16cid="http://schemas.microsoft.com/office/word/2016/wordml/cid" xmlns:w16="http://schemas.microsoft.com/office/word/2018/wordml" xmlns:w16du="http://schemas.microsoft.com/office/word/2023/wordml/word16du" xmlns:w16sdtdh="http://schemas.microsoft.com/office/word/2020/wordml/sdtdatahash" xmlns:w16sdtfl="http://schemas.microsoft.com/office/word/2024/wordml/sdtformatlock" xmlns:w16se="http://schemas.microsoft.com/office/word/2015/wordml/symex" xmlns:wpg="http://schemas.microsoft.com/office/word/2010/wordprocessingGroup" xmlns:wpi="http://schemas.microsoft.com/office/word/2010/wordprocessingInk" xmlns:wne="http://schemas.microsoft.com/office/word/2006/wordml" xmlns:wps="http://schemas.microsoft.com/office/word/2010/wordprocessingShape" mc:Ignorable="w14 w15 w16se w16cid w16 w16cex w16sdtdh w16sdtfl w16du wp14">
   <w:footnote w:type="separator" w:id="-1">
     <w:p>
       <w:pPr>
@@ -5953,37 +5326,37 @@
 </file>
 
 <file path=word/header1.xml><?xml version="1.0" encoding="utf-8"?>
-<w:hdr xmlns:wpc="http://schemas.microsoft.com/office/word/2010/wordprocessingCanvas" xmlns:cx="http://schemas.microsoft.com/office/drawing/2014/chartex" xmlns:cx1="http://schemas.microsoft.com/office/drawing/2015/9/8/chartex" xmlns:cx2="http://schemas.microsoft.com/office/drawing/2015/10/21/chartex" xmlns:cx3="http://schemas.microsoft.com/office/drawing/2016/5/9/chartex" xmlns:cx4="http://schemas.microsoft.com/office/drawing/2016/5/10/chartex" xmlns:cx5="http://schemas.microsoft.com/office/drawing/2016/5/11/chartex" xmlns:cx6="http://schemas.microsoft.com/office/drawing/2016/5/12/chartex" xmlns:cx7="http://schemas.microsoft.com/office/drawing/2016/5/13/chartex" xmlns:cx8="http://schemas.microsoft.com/office/drawing/2016/5/14/chartex" xmlns:mc="http://schemas.openxmlformats.org/markup-compatibility/2006" xmlns:aink="http://schemas.microsoft.com/office/drawing/2016/ink" xmlns:am3d="http://schemas.microsoft.com/office/drawing/2017/model3d" xmlns:o="urn:schemas-microsoft-com:office:office" xmlns:oel="http://schemas.microsoft.com/office/2019/extlst" xmlns:r="http://schemas.openxmlformats.org/officeDocument/2006/relationships" xmlns:m="http://schemas.openxmlformats.org/officeDocument/2006/math" xmlns:v="urn:schemas-microsoft-com:vml" xmlns:wp14="http://schemas.microsoft.com/office/word/2010/wordprocessingDrawing" xmlns:wp="http://schemas.openxmlformats.org/drawingml/2006/wordprocessingDrawing" xmlns:w10="urn:schemas-microsoft-com:office:word" xmlns:w="http://schemas.openxmlformats.org/wordprocessingml/2006/main" xmlns:w14="http://schemas.microsoft.com/office/word/2010/wordml" xmlns:w15="http://schemas.microsoft.com/office/word/2012/wordml" xmlns:w16cex="http://schemas.microsoft.com/office/word/2018/wordml/cex" xmlns:w16cid="http://schemas.microsoft.com/office/word/2016/wordml/cid" xmlns:w16="http://schemas.microsoft.com/office/word/2018/wordml" xmlns:w16du="http://schemas.microsoft.com/office/word/2023/wordml/word16du" xmlns:w16sdtdh="http://schemas.microsoft.com/office/word/2020/wordml/sdtdatahash" xmlns:w16sdtfl="http://schemas.microsoft.com/office/word/2024/wordml/sdtformatlock" xmlns:w16se="http://schemas.microsoft.com/office/word/2015/wordml/symex" xmlns:wpg="http://schemas.microsoft.com/office/word/2010/wordprocessingGroup" xmlns:wpi="http://schemas.microsoft.com/office/word/2010/wordprocessingInk" xmlns:wne="http://schemas.microsoft.com/office/word/2006/wordml" xmlns:wps="http://schemas.microsoft.com/office/word/2010/wordprocessingShape" mc:Ignorable="w14 w15 w16se w16cid w16 w16cex w16sdtdh w16sdtfl w16du wp14">
+<w:hdr xmlns:wpc="http://schemas.microsoft.com/office/word/2010/wordprocessingCanvas" xmlns:cx="http://schemas.microsoft.com/office/drawing/2014/chartex" xmlns:cx1="http://schemas.microsoft.com/office/drawing/2015/9/8/chartex" xmlns:cx2="http://schemas.microsoft.com/office/drawing/2015/10/21/chartex" xmlns:cx3="http://schemas.microsoft.com/office/drawing/2016/5/9/chartex" xmlns:cx4="http://schemas.microsoft.com/office/drawing/2016/5/10/chartex" xmlns:cx5="http://schemas.microsoft.com/office/drawing/2016/5/11/chartex" xmlns:cx6="http://schemas.microsoft.com/office/drawing/2016/5/12/chartex" xmlns:cx7="http://schemas.microsoft.com/office/drawing/2016/5/13/chartex" xmlns:cx8="http://schemas.microsoft.com/office/drawing/2016/5/14/chartex" xmlns:mc="http://schemas.openxmlformats.org/markup-compatibility/2006" xmlns:aink="http://schemas.microsoft.com/office/drawing/2016/ink" xmlns:am3d="http://schemas.microsoft.com/office/drawing/2017/model3d" xmlns:o="urn:schemas-microsoft-com:office:office" xmlns:oel="http://schemas.microsoft.com/office/2019/extlst" xmlns:r="http://schemas.openxmlformats.org/officeDocument/2006/relationships" xmlns:m="http://schemas.openxmlformats.org/officeDocument/2006/math" xmlns:v="urn:schemas-microsoft-com:vml" xmlns:wp14="http://schemas.microsoft.com/office/word/2010/wordprocessingDrawing" xmlns:wp="http://schemas.openxmlformats.org/drawingml/2006/wordprocessingDrawing" xmlns:w10="urn:schemas-microsoft-com:office:word" xmlns:w="http://schemas.openxmlformats.org/wordprocessingml/2006/main" xmlns:w14="http://schemas.microsoft.com/office/word/2010/wordml" xmlns:w15="http://schemas.microsoft.com/office/word/2012/wordml" xmlns:w16cei="http://schemas.microsoft.com/office/word/2026/wordml/cei" xmlns:w16cex="http://schemas.microsoft.com/office/word/2018/wordml/cex" xmlns:w16cid="http://schemas.microsoft.com/office/word/2016/wordml/cid" xmlns:w16="http://schemas.microsoft.com/office/word/2018/wordml" xmlns:w16du="http://schemas.microsoft.com/office/word/2023/wordml/word16du" xmlns:w16sdtdh="http://schemas.microsoft.com/office/word/2020/wordml/sdtdatahash" xmlns:w16sdtfl="http://schemas.microsoft.com/office/word/2024/wordml/sdtformatlock" xmlns:w16se="http://schemas.microsoft.com/office/word/2015/wordml/symex" xmlns:wpg="http://schemas.microsoft.com/office/word/2010/wordprocessingGroup" xmlns:wpi="http://schemas.microsoft.com/office/word/2010/wordprocessingInk" xmlns:wne="http://schemas.microsoft.com/office/word/2006/wordml" xmlns:wps="http://schemas.microsoft.com/office/word/2010/wordprocessingShape" mc:Ignorable="w14 w15 w16se w16cid w16 w16cex w16sdtdh w16sdtfl w16du wp14">
   <w:p>
     <w:pPr>
-      <w:pStyle w:val="Header"/>
+      <w:pStyle w:val="a7"/>
     </w:pPr>
   </w:p>
 </w:hdr>
 </file>
 
 <file path=word/header2.xml><?xml version="1.0" encoding="utf-8"?>
-<w:hdr xmlns:wpc="http://schemas.microsoft.com/office/word/2010/wordprocessingCanvas" xmlns:cx="http://schemas.microsoft.com/office/drawing/2014/chartex" xmlns:cx1="http://schemas.microsoft.com/office/drawing/2015/9/8/chartex" xmlns:cx2="http://schemas.microsoft.com/office/drawing/2015/10/21/chartex" xmlns:cx3="http://schemas.microsoft.com/office/drawing/2016/5/9/chartex" xmlns:cx4="http://schemas.microsoft.com/office/drawing/2016/5/10/chartex" xmlns:cx5="http://schemas.microsoft.com/office/drawing/2016/5/11/chartex" xmlns:cx6="http://schemas.microsoft.com/office/drawing/2016/5/12/chartex" xmlns:cx7="http://schemas.microsoft.com/office/drawing/2016/5/13/chartex" xmlns:cx8="http://schemas.microsoft.com/office/drawing/2016/5/14/chartex" xmlns:mc="http://schemas.openxmlformats.org/markup-compatibility/2006" xmlns:aink="http://schemas.microsoft.com/office/drawing/2016/ink" xmlns:am3d="http://schemas.microsoft.com/office/drawing/2017/model3d" xmlns:o="urn:schemas-microsoft-com:office:office" xmlns:oel="http://schemas.microsoft.com/office/2019/extlst" xmlns:r="http://schemas.openxmlformats.org/officeDocument/2006/relationships" xmlns:m="http://schemas.openxmlformats.org/officeDocument/2006/math" xmlns:v="urn:schemas-microsoft-com:vml" xmlns:wp14="http://schemas.microsoft.com/office/word/2010/wordprocessingDrawing" xmlns:wp="http://schemas.openxmlformats.org/drawingml/2006/wordprocessingDrawing" xmlns:w10="urn:schemas-microsoft-com:office:word" xmlns:w="http://schemas.openxmlformats.org/wordprocessingml/2006/main" xmlns:w14="http://schemas.microsoft.com/office/word/2010/wordml" xmlns:w15="http://schemas.microsoft.com/office/word/2012/wordml" xmlns:w16cex="http://schemas.microsoft.com/office/word/2018/wordml/cex" xmlns:w16cid="http://schemas.microsoft.com/office/word/2016/wordml/cid" xmlns:w16="http://schemas.microsoft.com/office/word/2018/wordml" xmlns:w16du="http://schemas.microsoft.com/office/word/2023/wordml/word16du" xmlns:w16sdtdh="http://schemas.microsoft.com/office/word/2020/wordml/sdtdatahash" xmlns:w16sdtfl="http://schemas.microsoft.com/office/word/2024/wordml/sdtformatlock" xmlns:w16se="http://schemas.microsoft.com/office/word/2015/wordml/symex" xmlns:wpg="http://schemas.microsoft.com/office/word/2010/wordprocessingGroup" xmlns:wpi="http://schemas.microsoft.com/office/word/2010/wordprocessingInk" xmlns:wne="http://schemas.microsoft.com/office/word/2006/wordml" xmlns:wps="http://schemas.microsoft.com/office/word/2010/wordprocessingShape" mc:Ignorable="w14 w15 w16se w16cid w16 w16cex w16sdtdh w16sdtfl w16du wp14">
+<w:hdr xmlns:wpc="http://schemas.microsoft.com/office/word/2010/wordprocessingCanvas" xmlns:cx="http://schemas.microsoft.com/office/drawing/2014/chartex" xmlns:cx1="http://schemas.microsoft.com/office/drawing/2015/9/8/chartex" xmlns:cx2="http://schemas.microsoft.com/office/drawing/2015/10/21/chartex" xmlns:cx3="http://schemas.microsoft.com/office/drawing/2016/5/9/chartex" xmlns:cx4="http://schemas.microsoft.com/office/drawing/2016/5/10/chartex" xmlns:cx5="http://schemas.microsoft.com/office/drawing/2016/5/11/chartex" xmlns:cx6="http://schemas.microsoft.com/office/drawing/2016/5/12/chartex" xmlns:cx7="http://schemas.microsoft.com/office/drawing/2016/5/13/chartex" xmlns:cx8="http://schemas.microsoft.com/office/drawing/2016/5/14/chartex" xmlns:mc="http://schemas.openxmlformats.org/markup-compatibility/2006" xmlns:aink="http://schemas.microsoft.com/office/drawing/2016/ink" xmlns:am3d="http://schemas.microsoft.com/office/drawing/2017/model3d" xmlns:o="urn:schemas-microsoft-com:office:office" xmlns:oel="http://schemas.microsoft.com/office/2019/extlst" xmlns:r="http://schemas.openxmlformats.org/officeDocument/2006/relationships" xmlns:m="http://schemas.openxmlformats.org/officeDocument/2006/math" xmlns:v="urn:schemas-microsoft-com:vml" xmlns:wp14="http://schemas.microsoft.com/office/word/2010/wordprocessingDrawing" xmlns:wp="http://schemas.openxmlformats.org/drawingml/2006/wordprocessingDrawing" xmlns:w10="urn:schemas-microsoft-com:office:word" xmlns:w="http://schemas.openxmlformats.org/wordprocessingml/2006/main" xmlns:w14="http://schemas.microsoft.com/office/word/2010/wordml" xmlns:w15="http://schemas.microsoft.com/office/word/2012/wordml" xmlns:w16cei="http://schemas.microsoft.com/office/word/2026/wordml/cei" xmlns:w16cex="http://schemas.microsoft.com/office/word/2018/wordml/cex" xmlns:w16cid="http://schemas.microsoft.com/office/word/2016/wordml/cid" xmlns:w16="http://schemas.microsoft.com/office/word/2018/wordml" xmlns:w16du="http://schemas.microsoft.com/office/word/2023/wordml/word16du" xmlns:w16sdtdh="http://schemas.microsoft.com/office/word/2020/wordml/sdtdatahash" xmlns:w16sdtfl="http://schemas.microsoft.com/office/word/2024/wordml/sdtformatlock" xmlns:w16se="http://schemas.microsoft.com/office/word/2015/wordml/symex" xmlns:wpg="http://schemas.microsoft.com/office/word/2010/wordprocessingGroup" xmlns:wpi="http://schemas.microsoft.com/office/word/2010/wordprocessingInk" xmlns:wne="http://schemas.microsoft.com/office/word/2006/wordml" xmlns:wps="http://schemas.microsoft.com/office/word/2010/wordprocessingShape" mc:Ignorable="w14 w15 w16se w16cid w16 w16cex w16sdtdh w16sdtfl w16du wp14">
   <w:p>
     <w:pPr>
-      <w:pStyle w:val="Header"/>
+      <w:pStyle w:val="a7"/>
     </w:pPr>
   </w:p>
 </w:hdr>
 </file>
 
 <file path=word/header3.xml><?xml version="1.0" encoding="utf-8"?>
-<w:hdr xmlns:wpc="http://schemas.microsoft.com/office/word/2010/wordprocessingCanvas" xmlns:cx="http://schemas.microsoft.com/office/drawing/2014/chartex" xmlns:cx1="http://schemas.microsoft.com/office/drawing/2015/9/8/chartex" xmlns:cx2="http://schemas.microsoft.com/office/drawing/2015/10/21/chartex" xmlns:cx3="http://schemas.microsoft.com/office/drawing/2016/5/9/chartex" xmlns:cx4="http://schemas.microsoft.com/office/drawing/2016/5/10/chartex" xmlns:cx5="http://schemas.microsoft.com/office/drawing/2016/5/11/chartex" xmlns:cx6="http://schemas.microsoft.com/office/drawing/2016/5/12/chartex" xmlns:cx7="http://schemas.microsoft.com/office/drawing/2016/5/13/chartex" xmlns:cx8="http://schemas.microsoft.com/office/drawing/2016/5/14/chartex" xmlns:mc="http://schemas.openxmlformats.org/markup-compatibility/2006" xmlns:aink="http://schemas.microsoft.com/office/drawing/2016/ink" xmlns:am3d="http://schemas.microsoft.com/office/drawing/2017/model3d" xmlns:o="urn:schemas-microsoft-com:office:office" xmlns:oel="http://schemas.microsoft.com/office/2019/extlst" xmlns:r="http://schemas.openxmlformats.org/officeDocument/2006/relationships" xmlns:m="http://schemas.openxmlformats.org/officeDocument/2006/math" xmlns:v="urn:schemas-microsoft-com:vml" xmlns:wp14="http://schemas.microsoft.com/office/word/2010/wordprocessingDrawing" xmlns:wp="http://schemas.openxmlformats.org/drawingml/2006/wordprocessingDrawing" xmlns:w10="urn:schemas-microsoft-com:office:word" xmlns:w="http://schemas.openxmlformats.org/wordprocessingml/2006/main" xmlns:w14="http://schemas.microsoft.com/office/word/2010/wordml" xmlns:w15="http://schemas.microsoft.com/office/word/2012/wordml" xmlns:w16cex="http://schemas.microsoft.com/office/word/2018/wordml/cex" xmlns:w16cid="http://schemas.microsoft.com/office/word/2016/wordml/cid" xmlns:w16="http://schemas.microsoft.com/office/word/2018/wordml" xmlns:w16du="http://schemas.microsoft.com/office/word/2023/wordml/word16du" xmlns:w16sdtdh="http://schemas.microsoft.com/office/word/2020/wordml/sdtdatahash" xmlns:w16sdtfl="http://schemas.microsoft.com/office/word/2024/wordml/sdtformatlock" xmlns:w16se="http://schemas.microsoft.com/office/word/2015/wordml/symex" xmlns:wpg="http://schemas.microsoft.com/office/word/2010/wordprocessingGroup" xmlns:wpi="http://schemas.microsoft.com/office/word/2010/wordprocessingInk" xmlns:wne="http://schemas.microsoft.com/office/word/2006/wordml" xmlns:wps="http://schemas.microsoft.com/office/word/2010/wordprocessingShape" mc:Ignorable="w14 w15 w16se w16cid w16 w16cex w16sdtdh w16sdtfl w16du wp14">
+<w:hdr xmlns:wpc="http://schemas.microsoft.com/office/word/2010/wordprocessingCanvas" xmlns:cx="http://schemas.microsoft.com/office/drawing/2014/chartex" xmlns:cx1="http://schemas.microsoft.com/office/drawing/2015/9/8/chartex" xmlns:cx2="http://schemas.microsoft.com/office/drawing/2015/10/21/chartex" xmlns:cx3="http://schemas.microsoft.com/office/drawing/2016/5/9/chartex" xmlns:cx4="http://schemas.microsoft.com/office/drawing/2016/5/10/chartex" xmlns:cx5="http://schemas.microsoft.com/office/drawing/2016/5/11/chartex" xmlns:cx6="http://schemas.microsoft.com/office/drawing/2016/5/12/chartex" xmlns:cx7="http://schemas.microsoft.com/office/drawing/2016/5/13/chartex" xmlns:cx8="http://schemas.microsoft.com/office/drawing/2016/5/14/chartex" xmlns:mc="http://schemas.openxmlformats.org/markup-compatibility/2006" xmlns:aink="http://schemas.microsoft.com/office/drawing/2016/ink" xmlns:am3d="http://schemas.microsoft.com/office/drawing/2017/model3d" xmlns:o="urn:schemas-microsoft-com:office:office" xmlns:oel="http://schemas.microsoft.com/office/2019/extlst" xmlns:r="http://schemas.openxmlformats.org/officeDocument/2006/relationships" xmlns:m="http://schemas.openxmlformats.org/officeDocument/2006/math" xmlns:v="urn:schemas-microsoft-com:vml" xmlns:wp14="http://schemas.microsoft.com/office/word/2010/wordprocessingDrawing" xmlns:wp="http://schemas.openxmlformats.org/drawingml/2006/wordprocessingDrawing" xmlns:w10="urn:schemas-microsoft-com:office:word" xmlns:w="http://schemas.openxmlformats.org/wordprocessingml/2006/main" xmlns:w14="http://schemas.microsoft.com/office/word/2010/wordml" xmlns:w15="http://schemas.microsoft.com/office/word/2012/wordml" xmlns:w16cei="http://schemas.microsoft.com/office/word/2026/wordml/cei" xmlns:w16cex="http://schemas.microsoft.com/office/word/2018/wordml/cex" xmlns:w16cid="http://schemas.microsoft.com/office/word/2016/wordml/cid" xmlns:w16="http://schemas.microsoft.com/office/word/2018/wordml" xmlns:w16du="http://schemas.microsoft.com/office/word/2023/wordml/word16du" xmlns:w16sdtdh="http://schemas.microsoft.com/office/word/2020/wordml/sdtdatahash" xmlns:w16sdtfl="http://schemas.microsoft.com/office/word/2024/wordml/sdtformatlock" xmlns:w16se="http://schemas.microsoft.com/office/word/2015/wordml/symex" xmlns:wpg="http://schemas.microsoft.com/office/word/2010/wordprocessingGroup" xmlns:wpi="http://schemas.microsoft.com/office/word/2010/wordprocessingInk" xmlns:wne="http://schemas.microsoft.com/office/word/2006/wordml" xmlns:wps="http://schemas.microsoft.com/office/word/2010/wordprocessingShape" mc:Ignorable="w14 w15 w16se w16cid w16 w16cex w16sdtdh w16sdtfl w16du wp14">
   <w:p>
     <w:pPr>
-      <w:pStyle w:val="Header"/>
+      <w:pStyle w:val="a7"/>
     </w:pPr>
   </w:p>
 </w:hdr>
 </file>
 
 <file path=word/numbering.xml><?xml version="1.0" encoding="utf-8"?>
-<w:numbering xmlns:wpc="http://schemas.microsoft.com/office/word/2010/wordprocessingCanvas" xmlns:cx="http://schemas.microsoft.com/office/drawing/2014/chartex" xmlns:cx1="http://schemas.microsoft.com/office/drawing/2015/9/8/chartex" xmlns:cx2="http://schemas.microsoft.com/office/drawing/2015/10/21/chartex" xmlns:cx3="http://schemas.microsoft.com/office/drawing/2016/5/9/chartex" xmlns:cx4="http://schemas.microsoft.com/office/drawing/2016/5/10/chartex" xmlns:cx5="http://schemas.microsoft.com/office/drawing/2016/5/11/chartex" xmlns:cx6="http://schemas.microsoft.com/office/drawing/2016/5/12/chartex" xmlns:cx7="http://schemas.microsoft.com/office/drawing/2016/5/13/chartex" xmlns:cx8="http://schemas.microsoft.com/office/drawing/2016/5/14/chartex" xmlns:mc="http://schemas.openxmlformats.org/markup-compatibility/2006" xmlns:aink="http://schemas.microsoft.com/office/drawing/2016/ink" xmlns:am3d="http://schemas.microsoft.com/office/drawing/2017/model3d" xmlns:o="urn:schemas-microsoft-com:office:office" xmlns:oel="http://schemas.microsoft.com/office/2019/extlst" xmlns:r="http://schemas.openxmlformats.org/officeDocument/2006/relationships" xmlns:m="http://schemas.openxmlformats.org/officeDocument/2006/math" xmlns:v="urn:schemas-microsoft-com:vml" xmlns:wp14="http://schemas.microsoft.com/office/word/2010/wordprocessingDrawing" xmlns:wp="http://schemas.openxmlformats.org/drawingml/2006/wordprocessingDrawing" xmlns:w10="urn:schemas-microsoft-com:office:word" xmlns:w="http://schemas.openxmlformats.org/wordprocessingml/2006/main" xmlns:w14="http://schemas.microsoft.com/office/word/2010/wordml" xmlns:w15="http://schemas.microsoft.com/office/word/2012/wordml" xmlns:w16cex="http://schemas.microsoft.com/office/word/2018/wordml/cex" xmlns:w16cid="http://schemas.microsoft.com/office/word/2016/wordml/cid" xmlns:w16="http://schemas.microsoft.com/office/word/2018/wordml" xmlns:w16du="http://schemas.microsoft.com/office/word/2023/wordml/word16du" xmlns:w16sdtdh="http://schemas.microsoft.com/office/word/2020/wordml/sdtdatahash" xmlns:w16sdtfl="http://schemas.microsoft.com/office/word/2024/wordml/sdtformatlock" xmlns:w16se="http://schemas.microsoft.com/office/word/2015/wordml/symex" xmlns:wpg="http://schemas.microsoft.com/office/word/2010/wordprocessingGroup" xmlns:wpi="http://schemas.microsoft.com/office/word/2010/wordprocessingInk" xmlns:wne="http://schemas.microsoft.com/office/word/2006/wordml" xmlns:wps="http://schemas.microsoft.com/office/word/2010/wordprocessingShape" mc:Ignorable="w14 w15 w16se w16cid w16 w16cex w16sdtdh w16sdtfl w16du wp14">
+<w:numbering xmlns:wpc="http://schemas.microsoft.com/office/word/2010/wordprocessingCanvas" xmlns:cx="http://schemas.microsoft.com/office/drawing/2014/chartex" xmlns:cx1="http://schemas.microsoft.com/office/drawing/2015/9/8/chartex" xmlns:cx2="http://schemas.microsoft.com/office/drawing/2015/10/21/chartex" xmlns:cx3="http://schemas.microsoft.com/office/drawing/2016/5/9/chartex" xmlns:cx4="http://schemas.microsoft.com/office/drawing/2016/5/10/chartex" xmlns:cx5="http://schemas.microsoft.com/office/drawing/2016/5/11/chartex" xmlns:cx6="http://schemas.microsoft.com/office/drawing/2016/5/12/chartex" xmlns:cx7="http://schemas.microsoft.com/office/drawing/2016/5/13/chartex" xmlns:cx8="http://schemas.microsoft.com/office/drawing/2016/5/14/chartex" xmlns:mc="http://schemas.openxmlformats.org/markup-compatibility/2006" xmlns:aink="http://schemas.microsoft.com/office/drawing/2016/ink" xmlns:am3d="http://schemas.microsoft.com/office/drawing/2017/model3d" xmlns:o="urn:schemas-microsoft-com:office:office" xmlns:oel="http://schemas.microsoft.com/office/2019/extlst" xmlns:r="http://schemas.openxmlformats.org/officeDocument/2006/relationships" xmlns:m="http://schemas.openxmlformats.org/officeDocument/2006/math" xmlns:v="urn:schemas-microsoft-com:vml" xmlns:wp14="http://schemas.microsoft.com/office/word/2010/wordprocessingDrawing" xmlns:wp="http://schemas.openxmlformats.org/drawingml/2006/wordprocessingDrawing" xmlns:w10="urn:schemas-microsoft-com:office:word" xmlns:w="http://schemas.openxmlformats.org/wordprocessingml/2006/main" xmlns:w14="http://schemas.microsoft.com/office/word/2010/wordml" xmlns:w15="http://schemas.microsoft.com/office/word/2012/wordml" xmlns:w16cei="http://schemas.microsoft.com/office/word/2026/wordml/cei" xmlns:w16cex="http://schemas.microsoft.com/office/word/2018/wordml/cex" xmlns:w16cid="http://schemas.microsoft.com/office/word/2016/wordml/cid" xmlns:w16="http://schemas.microsoft.com/office/word/2018/wordml" xmlns:w16du="http://schemas.microsoft.com/office/word/2023/wordml/word16du" xmlns:w16sdtdh="http://schemas.microsoft.com/office/word/2020/wordml/sdtdatahash" xmlns:w16sdtfl="http://schemas.microsoft.com/office/word/2024/wordml/sdtformatlock" xmlns:w16se="http://schemas.microsoft.com/office/word/2015/wordml/symex" xmlns:wpg="http://schemas.microsoft.com/office/word/2010/wordprocessingGroup" xmlns:wpi="http://schemas.microsoft.com/office/word/2010/wordprocessingInk" xmlns:wne="http://schemas.microsoft.com/office/word/2006/wordml" xmlns:wps="http://schemas.microsoft.com/office/word/2010/wordprocessingShape" mc:Ignorable="w14 w15 w16se w16cid w16 w16cex w16sdtdh w16sdtfl w16du wp14">
   <w:abstractNum w:abstractNumId="0" w15:restartNumberingAfterBreak="0">
     <w:nsid w:val="192548C2"/>
     <w:multiLevelType w:val="multilevel"/>
@@ -6529,7 +5902,7 @@
     <w:lvl w:ilvl="0">
       <w:start w:val="1"/>
       <w:numFmt w:val="decimal"/>
-      <w:pStyle w:val="Heading1"/>
+      <w:pStyle w:val="1"/>
       <w:lvlText w:val="%1"/>
       <w:lvlJc w:val="left"/>
       <w:pPr>
@@ -7090,15 +6463,15 @@
     <w:lsdException w:name="Unresolved Mention" w:semiHidden="1" w:unhideWhenUsed="1"/>
     <w:lsdException w:name="Smart Link" w:semiHidden="1" w:unhideWhenUsed="1"/>
   </w:latentStyles>
-  <w:style w:type="paragraph" w:default="1" w:styleId="Normal">
+  <w:style w:type="paragraph" w:default="1" w:styleId="a">
     <w:name w:val="Normal"/>
     <w:qFormat/>
   </w:style>
-  <w:style w:type="paragraph" w:styleId="Heading1">
+  <w:style w:type="paragraph" w:styleId="1">
     <w:name w:val="heading 1"/>
-    <w:basedOn w:val="Normal"/>
-    <w:next w:val="Normal"/>
-    <w:link w:val="Heading1Char"/>
+    <w:basedOn w:val="a"/>
+    <w:next w:val="a"/>
+    <w:link w:val="10"/>
     <w:uiPriority w:val="9"/>
     <w:qFormat/>
     <w:rsid w:val="009730E4"/>
@@ -7119,13 +6492,12 @@
       <w:lang w:eastAsia="en-GB"/>
     </w:rPr>
   </w:style>
-  <w:style w:type="character" w:default="1" w:styleId="DefaultParagraphFont">
+  <w:style w:type="character" w:default="1" w:styleId="a0">
     <w:name w:val="Default Paragraph Font"/>
     <w:uiPriority w:val="1"/>
-    <w:semiHidden/>
     <w:unhideWhenUsed/>
   </w:style>
-  <w:style w:type="table" w:default="1" w:styleId="TableNormal">
+  <w:style w:type="table" w:default="1" w:styleId="a1">
     <w:name w:val="Normal Table"/>
     <w:uiPriority w:val="99"/>
     <w:semiHidden/>
@@ -7140,16 +6512,16 @@
       </w:tblCellMar>
     </w:tblPr>
   </w:style>
-  <w:style w:type="numbering" w:default="1" w:styleId="NoList">
+  <w:style w:type="numbering" w:default="1" w:styleId="a2">
     <w:name w:val="No List"/>
     <w:uiPriority w:val="99"/>
     <w:semiHidden/>
     <w:unhideWhenUsed/>
   </w:style>
-  <w:style w:type="paragraph" w:styleId="CommentText">
+  <w:style w:type="paragraph" w:styleId="a3">
     <w:name w:val="annotation text"/>
-    <w:basedOn w:val="Normal"/>
-    <w:link w:val="CommentTextChar"/>
+    <w:basedOn w:val="a"/>
+    <w:link w:val="a4"/>
     <w:uiPriority w:val="99"/>
     <w:semiHidden/>
     <w:unhideWhenUsed/>
@@ -7163,10 +6535,10 @@
       <w:lang w:eastAsia="en-GB"/>
     </w:rPr>
   </w:style>
-  <w:style w:type="character" w:customStyle="1" w:styleId="CommentTextChar">
-    <w:name w:val="Comment Text Char"/>
-    <w:basedOn w:val="DefaultParagraphFont"/>
-    <w:link w:val="CommentText"/>
+  <w:style w:type="character" w:customStyle="1" w:styleId="a4">
+    <w:name w:val="Текст примечания Знак"/>
+    <w:basedOn w:val="a0"/>
+    <w:link w:val="a3"/>
     <w:uiPriority w:val="99"/>
     <w:semiHidden/>
     <w:rPr>
@@ -7176,9 +6548,9 @@
       <w:lang w:eastAsia="en-GB"/>
     </w:rPr>
   </w:style>
-  <w:style w:type="character" w:styleId="CommentReference">
+  <w:style w:type="character" w:styleId="a5">
     <w:name w:val="annotation reference"/>
-    <w:basedOn w:val="DefaultParagraphFont"/>
+    <w:basedOn w:val="a0"/>
     <w:uiPriority w:val="99"/>
     <w:semiHidden/>
     <w:unhideWhenUsed/>
@@ -7187,9 +6559,9 @@
       <w:szCs w:val="16"/>
     </w:rPr>
   </w:style>
-  <w:style w:type="table" w:styleId="TableGrid">
+  <w:style w:type="table" w:styleId="a6">
     <w:name w:val="Table Grid"/>
-    <w:basedOn w:val="TableNormal"/>
+    <w:basedOn w:val="a1"/>
     <w:uiPriority w:val="59"/>
     <w:pPr>
       <w:spacing w:after="0" w:line="240" w:lineRule="auto"/>
@@ -7208,10 +6580,10 @@
       </w:tblBorders>
     </w:tblPr>
   </w:style>
-  <w:style w:type="paragraph" w:styleId="Header">
+  <w:style w:type="paragraph" w:styleId="a7">
     <w:name w:val="header"/>
-    <w:basedOn w:val="Normal"/>
-    <w:link w:val="HeaderChar"/>
+    <w:basedOn w:val="a"/>
+    <w:link w:val="a8"/>
     <w:uiPriority w:val="99"/>
     <w:unhideWhenUsed/>
     <w:pPr>
@@ -7226,20 +6598,20 @@
       <w:lang w:eastAsia="en-GB"/>
     </w:rPr>
   </w:style>
-  <w:style w:type="character" w:customStyle="1" w:styleId="HeaderChar">
-    <w:name w:val="Header Char"/>
-    <w:basedOn w:val="DefaultParagraphFont"/>
-    <w:link w:val="Header"/>
+  <w:style w:type="character" w:customStyle="1" w:styleId="a8">
+    <w:name w:val="Верхний колонтитул Знак"/>
+    <w:basedOn w:val="a0"/>
+    <w:link w:val="a7"/>
     <w:uiPriority w:val="99"/>
     <w:rPr>
       <w:rFonts w:ascii="Arial" w:eastAsia="Arial" w:hAnsi="Arial" w:cs="Arial"/>
       <w:lang w:eastAsia="en-GB"/>
     </w:rPr>
   </w:style>
-  <w:style w:type="paragraph" w:styleId="Footer">
+  <w:style w:type="paragraph" w:styleId="a9">
     <w:name w:val="footer"/>
-    <w:basedOn w:val="Normal"/>
-    <w:link w:val="FooterChar"/>
+    <w:basedOn w:val="a"/>
+    <w:link w:val="aa"/>
     <w:uiPriority w:val="99"/>
     <w:unhideWhenUsed/>
     <w:pPr>
@@ -7254,10 +6626,10 @@
       <w:lang w:eastAsia="en-GB"/>
     </w:rPr>
   </w:style>
-  <w:style w:type="character" w:customStyle="1" w:styleId="FooterChar">
-    <w:name w:val="Footer Char"/>
-    <w:basedOn w:val="DefaultParagraphFont"/>
-    <w:link w:val="Footer"/>
+  <w:style w:type="character" w:customStyle="1" w:styleId="aa">
+    <w:name w:val="Нижний колонтитул Знак"/>
+    <w:basedOn w:val="a0"/>
+    <w:link w:val="a9"/>
     <w:uiPriority w:val="99"/>
     <w:rPr>
       <w:rFonts w:ascii="Arial" w:eastAsia="Arial" w:hAnsi="Arial" w:cs="Arial"/>
@@ -7266,8 +6638,8 @@
   </w:style>
   <w:style w:type="table" w:customStyle="1" w:styleId="TableGrid1">
     <w:name w:val="Table Grid1"/>
-    <w:basedOn w:val="TableNormal"/>
-    <w:next w:val="TableGrid"/>
+    <w:basedOn w:val="a1"/>
+    <w:next w:val="a6"/>
     <w:uiPriority w:val="59"/>
     <w:pPr>
       <w:spacing w:after="0" w:line="240" w:lineRule="auto"/>
@@ -7283,10 +6655,10 @@
       </w:tblBorders>
     </w:tblPr>
   </w:style>
-  <w:style w:type="paragraph" w:styleId="BalloonText">
+  <w:style w:type="paragraph" w:styleId="ab">
     <w:name w:val="Balloon Text"/>
-    <w:basedOn w:val="Normal"/>
-    <w:link w:val="BalloonTextChar"/>
+    <w:basedOn w:val="a"/>
+    <w:link w:val="ac"/>
     <w:uiPriority w:val="99"/>
     <w:semiHidden/>
     <w:unhideWhenUsed/>
@@ -7299,10 +6671,10 @@
       <w:szCs w:val="18"/>
     </w:rPr>
   </w:style>
-  <w:style w:type="character" w:customStyle="1" w:styleId="BalloonTextChar">
-    <w:name w:val="Balloon Text Char"/>
-    <w:basedOn w:val="DefaultParagraphFont"/>
-    <w:link w:val="BalloonText"/>
+  <w:style w:type="character" w:customStyle="1" w:styleId="ac">
+    <w:name w:val="Текст выноски Знак"/>
+    <w:basedOn w:val="a0"/>
+    <w:link w:val="ab"/>
     <w:uiPriority w:val="99"/>
     <w:semiHidden/>
     <w:rPr>
@@ -7311,18 +6683,18 @@
       <w:szCs w:val="18"/>
     </w:rPr>
   </w:style>
-  <w:style w:type="character" w:styleId="PlaceholderText">
+  <w:style w:type="character" w:styleId="ad">
     <w:name w:val="Placeholder Text"/>
-    <w:basedOn w:val="DefaultParagraphFont"/>
+    <w:basedOn w:val="a0"/>
     <w:uiPriority w:val="99"/>
     <w:semiHidden/>
     <w:rPr>
       <w:color w:val="808080"/>
     </w:rPr>
   </w:style>
-  <w:style w:type="paragraph" w:styleId="NormalWeb">
+  <w:style w:type="paragraph" w:styleId="ae">
     <w:name w:val="Normal (Web)"/>
-    <w:basedOn w:val="Normal"/>
+    <w:basedOn w:val="a"/>
     <w:uiPriority w:val="99"/>
     <w:unhideWhenUsed/>
     <w:pPr>
@@ -7335,9 +6707,9 @@
       <w:lang w:eastAsia="en-GB"/>
     </w:rPr>
   </w:style>
-  <w:style w:type="paragraph" w:styleId="ListParagraph">
+  <w:style w:type="paragraph" w:styleId="af">
     <w:name w:val="List Paragraph"/>
-    <w:basedOn w:val="Normal"/>
+    <w:basedOn w:val="a"/>
     <w:uiPriority w:val="34"/>
     <w:qFormat/>
     <w:pPr>
@@ -7345,11 +6717,11 @@
       <w:contextualSpacing/>
     </w:pPr>
   </w:style>
-  <w:style w:type="paragraph" w:styleId="CommentSubject">
+  <w:style w:type="paragraph" w:styleId="af0">
     <w:name w:val="annotation subject"/>
-    <w:basedOn w:val="CommentText"/>
-    <w:next w:val="CommentText"/>
-    <w:link w:val="CommentSubjectChar"/>
+    <w:basedOn w:val="a3"/>
+    <w:next w:val="a3"/>
+    <w:link w:val="af1"/>
     <w:uiPriority w:val="99"/>
     <w:semiHidden/>
     <w:unhideWhenUsed/>
@@ -7363,10 +6735,10 @@
       <w:lang w:eastAsia="en-US"/>
     </w:rPr>
   </w:style>
-  <w:style w:type="character" w:customStyle="1" w:styleId="CommentSubjectChar">
-    <w:name w:val="Comment Subject Char"/>
-    <w:basedOn w:val="CommentTextChar"/>
-    <w:link w:val="CommentSubject"/>
+  <w:style w:type="character" w:customStyle="1" w:styleId="af1">
+    <w:name w:val="Тема примечания Знак"/>
+    <w:basedOn w:val="a4"/>
+    <w:link w:val="af0"/>
     <w:uiPriority w:val="99"/>
     <w:semiHidden/>
     <w:rPr>
@@ -7378,7 +6750,7 @@
       <w:lang w:eastAsia="en-GB"/>
     </w:rPr>
   </w:style>
-  <w:style w:type="paragraph" w:styleId="Revision">
+  <w:style w:type="paragraph" w:styleId="af2">
     <w:name w:val="Revision"/>
     <w:hidden/>
     <w:uiPriority w:val="99"/>
@@ -7389,8 +6761,8 @@
   </w:style>
   <w:style w:type="table" w:customStyle="1" w:styleId="TableGrid2">
     <w:name w:val="Table Grid2"/>
-    <w:basedOn w:val="TableNormal"/>
-    <w:next w:val="TableGrid"/>
+    <w:basedOn w:val="a1"/>
+    <w:next w:val="a6"/>
     <w:uiPriority w:val="59"/>
     <w:pPr>
       <w:spacing w:after="0" w:line="240" w:lineRule="auto"/>
@@ -7411,8 +6783,8 @@
   </w:style>
   <w:style w:type="table" w:customStyle="1" w:styleId="TableGrid11">
     <w:name w:val="Table Grid11"/>
-    <w:basedOn w:val="TableNormal"/>
-    <w:next w:val="TableGrid"/>
+    <w:basedOn w:val="a1"/>
+    <w:next w:val="a6"/>
     <w:uiPriority w:val="59"/>
     <w:pPr>
       <w:spacing w:after="0" w:line="240" w:lineRule="auto"/>
@@ -7428,9 +6800,9 @@
       </w:tblBorders>
     </w:tblPr>
   </w:style>
-  <w:style w:type="character" w:styleId="Hyperlink">
+  <w:style w:type="character" w:styleId="af3">
     <w:name w:val="Hyperlink"/>
-    <w:basedOn w:val="DefaultParagraphFont"/>
+    <w:basedOn w:val="a0"/>
     <w:uiPriority w:val="99"/>
     <w:unhideWhenUsed/>
     <w:rPr>
@@ -7440,7 +6812,7 @@
   </w:style>
   <w:style w:type="character" w:customStyle="1" w:styleId="UnresolvedMention1">
     <w:name w:val="Unresolved Mention1"/>
-    <w:basedOn w:val="DefaultParagraphFont"/>
+    <w:basedOn w:val="a0"/>
     <w:uiPriority w:val="99"/>
     <w:semiHidden/>
     <w:unhideWhenUsed/>
@@ -7449,9 +6821,9 @@
       <w:shd w:val="clear" w:color="auto" w:fill="E1DFDD"/>
     </w:rPr>
   </w:style>
-  <w:style w:type="character" w:styleId="FollowedHyperlink">
+  <w:style w:type="character" w:styleId="af4">
     <w:name w:val="FollowedHyperlink"/>
-    <w:basedOn w:val="DefaultParagraphFont"/>
+    <w:basedOn w:val="a0"/>
     <w:uiPriority w:val="99"/>
     <w:semiHidden/>
     <w:unhideWhenUsed/>
@@ -7460,9 +6832,9 @@
       <w:u w:val="single"/>
     </w:rPr>
   </w:style>
-  <w:style w:type="character" w:styleId="UnresolvedMention">
+  <w:style w:type="character" w:styleId="af5">
     <w:name w:val="Unresolved Mention"/>
-    <w:basedOn w:val="DefaultParagraphFont"/>
+    <w:basedOn w:val="a0"/>
     <w:uiPriority w:val="99"/>
     <w:semiHidden/>
     <w:unhideWhenUsed/>
@@ -7472,11 +6844,11 @@
       <w:shd w:val="clear" w:color="auto" w:fill="E1DFDD"/>
     </w:rPr>
   </w:style>
-  <w:style w:type="paragraph" w:styleId="Title">
+  <w:style w:type="paragraph" w:styleId="af6">
     <w:name w:val="Title"/>
-    <w:basedOn w:val="Normal"/>
-    <w:next w:val="Normal"/>
-    <w:link w:val="TitleChar"/>
+    <w:basedOn w:val="a"/>
+    <w:next w:val="a"/>
+    <w:link w:val="af7"/>
     <w:uiPriority w:val="10"/>
     <w:qFormat/>
     <w:rsid w:val="009730E4"/>
@@ -7490,10 +6862,10 @@
       <w:sz w:val="28"/>
     </w:rPr>
   </w:style>
-  <w:style w:type="character" w:customStyle="1" w:styleId="TitleChar">
-    <w:name w:val="Title Char"/>
-    <w:basedOn w:val="DefaultParagraphFont"/>
-    <w:link w:val="Title"/>
+  <w:style w:type="character" w:customStyle="1" w:styleId="af7">
+    <w:name w:val="Заголовок Знак"/>
+    <w:basedOn w:val="a0"/>
+    <w:link w:val="af6"/>
     <w:uiPriority w:val="10"/>
     <w:rsid w:val="009730E4"/>
     <w:rPr>
@@ -7503,10 +6875,10 @@
       <w:sz w:val="28"/>
     </w:rPr>
   </w:style>
-  <w:style w:type="character" w:customStyle="1" w:styleId="Heading1Char">
-    <w:name w:val="Heading 1 Char"/>
-    <w:basedOn w:val="DefaultParagraphFont"/>
-    <w:link w:val="Heading1"/>
+  <w:style w:type="character" w:customStyle="1" w:styleId="10">
+    <w:name w:val="Заголовок 1 Знак"/>
+    <w:basedOn w:val="a0"/>
+    <w:link w:val="1"/>
     <w:uiPriority w:val="9"/>
     <w:rsid w:val="009730E4"/>
     <w:rPr>
@@ -7521,7 +6893,7 @@
 </file>
 
 <file path=word/glossary/document.xml><?xml version="1.0" encoding="utf-8"?>
-<w:glossaryDocument xmlns:wpc="http://schemas.microsoft.com/office/word/2010/wordprocessingCanvas" xmlns:cx="http://schemas.microsoft.com/office/drawing/2014/chartex" xmlns:cx1="http://schemas.microsoft.com/office/drawing/2015/9/8/chartex" xmlns:cx2="http://schemas.microsoft.com/office/drawing/2015/10/21/chartex" xmlns:cx3="http://schemas.microsoft.com/office/drawing/2016/5/9/chartex" xmlns:cx4="http://schemas.microsoft.com/office/drawing/2016/5/10/chartex" xmlns:cx5="http://schemas.microsoft.com/office/drawing/2016/5/11/chartex" xmlns:cx6="http://schemas.microsoft.com/office/drawing/2016/5/12/chartex" xmlns:cx7="http://schemas.microsoft.com/office/drawing/2016/5/13/chartex" xmlns:cx8="http://schemas.microsoft.com/office/drawing/2016/5/14/chartex" xmlns:mc="http://schemas.openxmlformats.org/markup-compatibility/2006" xmlns:aink="http://schemas.microsoft.com/office/drawing/2016/ink" xmlns:am3d="http://schemas.microsoft.com/office/drawing/2017/model3d" xmlns:o="urn:schemas-microsoft-com:office:office" xmlns:oel="http://schemas.microsoft.com/office/2019/extlst" xmlns:r="http://schemas.openxmlformats.org/officeDocument/2006/relationships" xmlns:m="http://schemas.openxmlformats.org/officeDocument/2006/math" xmlns:v="urn:schemas-microsoft-com:vml" xmlns:wp14="http://schemas.microsoft.com/office/word/2010/wordprocessingDrawing" xmlns:wp="http://schemas.openxmlformats.org/drawingml/2006/wordprocessingDrawing" xmlns:w10="urn:schemas-microsoft-com:office:word" xmlns:w="http://schemas.openxmlformats.org/wordprocessingml/2006/main" xmlns:w14="http://schemas.microsoft.com/office/word/2010/wordml" xmlns:w15="http://schemas.microsoft.com/office/word/2012/wordml" xmlns:w16cex="http://schemas.microsoft.com/office/word/2018/wordml/cex" xmlns:w16cid="http://schemas.microsoft.com/office/word/2016/wordml/cid" xmlns:w16="http://schemas.microsoft.com/office/word/2018/wordml" xmlns:w16du="http://schemas.microsoft.com/office/word/2023/wordml/word16du" xmlns:w16sdtdh="http://schemas.microsoft.com/office/word/2020/wordml/sdtdatahash" xmlns:w16sdtfl="http://schemas.microsoft.com/office/word/2024/wordml/sdtformatlock" xmlns:w16se="http://schemas.microsoft.com/office/word/2015/wordml/symex" xmlns:wpg="http://schemas.microsoft.com/office/word/2010/wordprocessingGroup" xmlns:wpi="http://schemas.microsoft.com/office/word/2010/wordprocessingInk" xmlns:wne="http://schemas.microsoft.com/office/word/2006/wordml" xmlns:wps="http://schemas.microsoft.com/office/word/2010/wordprocessingShape" mc:Ignorable="w14 w15 w16se w16cid w16 w16cex w16sdtdh w16sdtfl w16du wp14">
+<w:glossaryDocument xmlns:wpc="http://schemas.microsoft.com/office/word/2010/wordprocessingCanvas" xmlns:cx="http://schemas.microsoft.com/office/drawing/2014/chartex" xmlns:cx1="http://schemas.microsoft.com/office/drawing/2015/9/8/chartex" xmlns:cx2="http://schemas.microsoft.com/office/drawing/2015/10/21/chartex" xmlns:cx3="http://schemas.microsoft.com/office/drawing/2016/5/9/chartex" xmlns:cx4="http://schemas.microsoft.com/office/drawing/2016/5/10/chartex" xmlns:cx5="http://schemas.microsoft.com/office/drawing/2016/5/11/chartex" xmlns:cx6="http://schemas.microsoft.com/office/drawing/2016/5/12/chartex" xmlns:cx7="http://schemas.microsoft.com/office/drawing/2016/5/13/chartex" xmlns:cx8="http://schemas.microsoft.com/office/drawing/2016/5/14/chartex" xmlns:mc="http://schemas.openxmlformats.org/markup-compatibility/2006" xmlns:aink="http://schemas.microsoft.com/office/drawing/2016/ink" xmlns:am3d="http://schemas.microsoft.com/office/drawing/2017/model3d" xmlns:o="urn:schemas-microsoft-com:office:office" xmlns:oel="http://schemas.microsoft.com/office/2019/extlst" xmlns:r="http://schemas.openxmlformats.org/officeDocument/2006/relationships" xmlns:m="http://schemas.openxmlformats.org/officeDocument/2006/math" xmlns:v="urn:schemas-microsoft-com:vml" xmlns:wp14="http://schemas.microsoft.com/office/word/2010/wordprocessingDrawing" xmlns:wp="http://schemas.openxmlformats.org/drawingml/2006/wordprocessingDrawing" xmlns:w10="urn:schemas-microsoft-com:office:word" xmlns:w="http://schemas.openxmlformats.org/wordprocessingml/2006/main" xmlns:w14="http://schemas.microsoft.com/office/word/2010/wordml" xmlns:w15="http://schemas.microsoft.com/office/word/2012/wordml" xmlns:w16cei="http://schemas.microsoft.com/office/word/2026/wordml/cei" xmlns:w16cex="http://schemas.microsoft.com/office/word/2018/wordml/cex" xmlns:w16cid="http://schemas.microsoft.com/office/word/2016/wordml/cid" xmlns:w16="http://schemas.microsoft.com/office/word/2018/wordml" xmlns:w16du="http://schemas.microsoft.com/office/word/2023/wordml/word16du" xmlns:w16sdtdh="http://schemas.microsoft.com/office/word/2020/wordml/sdtdatahash" xmlns:w16sdtfl="http://schemas.microsoft.com/office/word/2024/wordml/sdtformatlock" xmlns:w16se="http://schemas.microsoft.com/office/word/2015/wordml/symex" xmlns:wpg="http://schemas.microsoft.com/office/word/2010/wordprocessingGroup" xmlns:wpi="http://schemas.microsoft.com/office/word/2010/wordprocessingInk" xmlns:wne="http://schemas.microsoft.com/office/word/2006/wordml" xmlns:wps="http://schemas.microsoft.com/office/word/2010/wordprocessingShape" mc:Ignorable="w14 w15 w16se w16cid w16 w16cex w16sdtdh w16sdtfl w16du wp14">
   <w:docParts>
     <w:docPart>
       <w:docPartPr>
@@ -7723,7 +7095,7 @@
 <w:fonts xmlns:mc="http://schemas.openxmlformats.org/markup-compatibility/2006" xmlns:r="http://schemas.openxmlformats.org/officeDocument/2006/relationships" xmlns:w="http://schemas.openxmlformats.org/wordprocessingml/2006/main" xmlns:w14="http://schemas.microsoft.com/office/word/2010/wordml" xmlns:w15="http://schemas.microsoft.com/office/word/2012/wordml" xmlns:w16cex="http://schemas.microsoft.com/office/word/2018/wordml/cex" xmlns:w16cid="http://schemas.microsoft.com/office/word/2016/wordml/cid" xmlns:w16="http://schemas.microsoft.com/office/word/2018/wordml" xmlns:w16du="http://schemas.microsoft.com/office/word/2023/wordml/word16du" xmlns:w16sdtdh="http://schemas.microsoft.com/office/word/2020/wordml/sdtdatahash" xmlns:w16sdtfl="http://schemas.microsoft.com/office/word/2024/wordml/sdtformatlock" xmlns:w16se="http://schemas.microsoft.com/office/word/2015/wordml/symex" mc:Ignorable="w14 w15 w16se w16cid w16 w16cex w16sdtdh w16sdtfl w16du">
   <w:font w:name="Calibri">
     <w:panose1 w:val="020F0502020204030204"/>
-    <w:charset w:val="00"/>
+    <w:charset w:val="CC"/>
     <w:family w:val="swiss"/>
     <w:pitch w:val="variable"/>
     <w:sig w:usb0="E4002EFF" w:usb1="C200247B" w:usb2="00000009" w:usb3="00000000" w:csb0="000001FF" w:csb1="00000000"/>
@@ -7737,7 +7109,7 @@
   </w:font>
   <w:font w:name="Arial">
     <w:panose1 w:val="020B0604020202020204"/>
-    <w:charset w:val="00"/>
+    <w:charset w:val="CC"/>
     <w:family w:val="swiss"/>
     <w:pitch w:val="variable"/>
     <w:sig w:usb0="E0002EFF" w:usb1="C000785B" w:usb2="00000009" w:usb3="00000000" w:csb0="000001FF" w:csb1="00000000"/>
@@ -7751,20 +7123,12 @@
   </w:font>
   <w:font w:name="Cambria">
     <w:panose1 w:val="02040503050406030204"/>
-    <w:charset w:val="00"/>
+    <w:charset w:val="CC"/>
     <w:family w:val="roman"/>
     <w:pitch w:val="variable"/>
     <w:sig w:usb0="E00006FF" w:usb1="420024FF" w:usb2="02000000" w:usb3="00000000" w:csb0="0000019F" w:csb1="00000000"/>
   </w:font>
-  <w:font w:name="Tahoma">
-    <w:panose1 w:val="020B0604030504040204"/>
-    <w:charset w:val="00"/>
-    <w:family w:val="swiss"/>
-    <w:pitch w:val="variable"/>
-    <w:sig w:usb0="E1002EFF" w:usb1="C000605B" w:usb2="00000029" w:usb3="00000000" w:csb0="000101FF" w:csb1="00000000"/>
-  </w:font>
   <w:font w:name="DengXian Light">
-    <w:altName w:val="等线 Light"/>
     <w:charset w:val="86"/>
     <w:family w:val="auto"/>
     <w:pitch w:val="variable"/>
@@ -7772,13 +7136,12 @@
   </w:font>
   <w:font w:name="Calibri Light">
     <w:panose1 w:val="020F0302020204030204"/>
-    <w:charset w:val="00"/>
+    <w:charset w:val="CC"/>
     <w:family w:val="swiss"/>
     <w:pitch w:val="variable"/>
     <w:sig w:usb0="E4002EFF" w:usb1="C200247B" w:usb2="00000009" w:usb3="00000000" w:csb0="000001FF" w:csb1="00000000"/>
   </w:font>
   <w:font w:name="DengXian">
-    <w:altName w:val="等线"/>
     <w:panose1 w:val="02010600030101010101"/>
     <w:charset w:val="86"/>
     <w:family w:val="auto"/>
@@ -7790,6 +7153,13 @@
     <w:family w:val="swiss"/>
     <w:pitch w:val="variable"/>
     <w:sig w:usb0="20000287" w:usb1="00000003" w:usb2="00000000" w:usb3="00000000" w:csb0="0000019F" w:csb1="00000000"/>
+  </w:font>
+  <w:font w:name="Tahoma">
+    <w:panose1 w:val="020B0604030504040204"/>
+    <w:charset w:val="CC"/>
+    <w:family w:val="swiss"/>
+    <w:pitch w:val="variable"/>
+    <w:sig w:usb0="E1002EFF" w:usb1="C000605B" w:usb2="00000029" w:usb3="00000000" w:csb0="000101FF" w:csb1="00000000"/>
   </w:font>
   <w:font w:name="Aptos Display">
     <w:charset w:val="00"/>
@@ -7828,6 +7198,7 @@
     <w:rsid w:val="001A74DB"/>
     <w:rsid w:val="001E57AD"/>
     <w:rsid w:val="00265F7E"/>
+    <w:rsid w:val="00280A4C"/>
     <w:rsid w:val="00281C34"/>
     <w:rsid w:val="00295AC9"/>
     <w:rsid w:val="002A1C32"/>
@@ -7865,6 +7236,7 @@
     <w:rsid w:val="00955F26"/>
     <w:rsid w:val="00987156"/>
     <w:rsid w:val="00A060B4"/>
+    <w:rsid w:val="00A54D6E"/>
     <w:rsid w:val="00A8697E"/>
     <w:rsid w:val="00AB39E9"/>
     <w:rsid w:val="00B929AF"/>
@@ -7903,8 +7275,8 @@
   </m:mathPr>
   <w:themeFontLang w:val="en-GB" w:eastAsia="zh-CN" w:bidi="ar-SA"/>
   <w:clrSchemeMapping w:bg1="light1" w:t1="dark1" w:bg2="light2" w:t2="dark2" w:accent1="accent1" w:accent2="accent2" w:accent3="accent3" w:accent4="accent4" w:accent5="accent5" w:accent6="accent6" w:hyperlink="hyperlink" w:followedHyperlink="followedHyperlink"/>
-  <w:decimalSymbol w:val="."/>
-  <w:listSeparator w:val=","/>
+  <w:decimalSymbol w:val=","/>
+  <w:listSeparator w:val=";"/>
   <w15:chartTrackingRefBased/>
 </w:settings>
 </file>
@@ -8304,17 +7676,17 @@
     <w:lsdException w:name="Unresolved Mention" w:semiHidden="1" w:unhideWhenUsed="1"/>
     <w:lsdException w:name="Smart Link" w:semiHidden="1" w:unhideWhenUsed="1"/>
   </w:latentStyles>
-  <w:style w:type="paragraph" w:default="1" w:styleId="Normal">
+  <w:style w:type="paragraph" w:default="1" w:styleId="a">
     <w:name w:val="Normal"/>
     <w:qFormat/>
   </w:style>
-  <w:style w:type="character" w:default="1" w:styleId="DefaultParagraphFont">
+  <w:style w:type="character" w:default="1" w:styleId="a0">
     <w:name w:val="Default Paragraph Font"/>
     <w:uiPriority w:val="1"/>
     <w:semiHidden/>
     <w:unhideWhenUsed/>
   </w:style>
-  <w:style w:type="table" w:default="1" w:styleId="TableNormal">
+  <w:style w:type="table" w:default="1" w:styleId="a1">
     <w:name w:val="Normal Table"/>
     <w:uiPriority w:val="99"/>
     <w:semiHidden/>
@@ -8329,15 +7701,15 @@
       </w:tblCellMar>
     </w:tblPr>
   </w:style>
-  <w:style w:type="numbering" w:default="1" w:styleId="NoList">
+  <w:style w:type="numbering" w:default="1" w:styleId="a2">
     <w:name w:val="No List"/>
     <w:uiPriority w:val="99"/>
     <w:semiHidden/>
     <w:unhideWhenUsed/>
   </w:style>
-  <w:style w:type="character" w:styleId="PlaceholderText">
+  <w:style w:type="character" w:styleId="a3">
     <w:name w:val="Placeholder Text"/>
-    <w:basedOn w:val="DefaultParagraphFont"/>
+    <w:basedOn w:val="a0"/>
     <w:uiPriority w:val="99"/>
     <w:semiHidden/>
     <w:rsid w:val="00D319AF"/>
@@ -8689,6 +8061,15 @@
 </file>
 
 <file path=customXml/item1.xml><?xml version="1.0" encoding="utf-8"?>
+<?mso-contentType ?>
+<FormTemplates xmlns="http://schemas.microsoft.com/sharepoint/v3/contenttype/forms">
+  <Display>DocumentLibraryForm</Display>
+  <Edit>DocumentLibraryForm</Edit>
+  <New>DocumentLibraryForm</New>
+</FormTemplates>
+</file>
+
+<file path=customXml/item2.xml><?xml version="1.0" encoding="utf-8"?>
 <ct:contentTypeSchema xmlns:ct="http://schemas.microsoft.com/office/2006/metadata/contentType" xmlns:ma="http://schemas.microsoft.com/office/2006/metadata/properties/metaAttributes" ct:_="" ma:_="" ma:contentTypeName="Document" ma:contentTypeID="0x0101006594185EF7D6AE4388B4DFE1EC566E5C" ma:contentTypeVersion="8" ma:contentTypeDescription="Create a new document." ma:contentTypeScope="" ma:versionID="62fc42f1a59fa6d77f518e5ebc18fa79">
   <xsd:schema xmlns:xsd="http://www.w3.org/2001/XMLSchema" xmlns:xs="http://www.w3.org/2001/XMLSchema" xmlns:p="http://schemas.microsoft.com/office/2006/metadata/properties" xmlns:ns2="554db4b9-e04f-48a1-af28-aa0b9c182b08" targetNamespace="http://schemas.microsoft.com/office/2006/metadata/properties" ma:root="true" ma:fieldsID="b82958f112d92b138a20c63765d4970f" ns2:_="">
     <xsd:import namespace="554db4b9-e04f-48a1-af28-aa0b9c182b08"/>
@@ -8856,17 +8237,10 @@
 </ct:contentTypeSchema>
 </file>
 
-<file path=customXml/item2.xml><?xml version="1.0" encoding="utf-8"?>
-<?mso-contentType ?>
-<FormTemplates xmlns="http://schemas.microsoft.com/sharepoint/v3/contenttype/forms">
-  <Display>DocumentLibraryForm</Display>
-  <Edit>DocumentLibraryForm</Edit>
-  <New>DocumentLibraryForm</New>
-</FormTemplates>
-</file>
-
 <file path=customXml/item3.xml><?xml version="1.0" encoding="utf-8"?>
-<Session xmlns="http://schemas.business-integrity.com/dealbuilder/2006/answers"/>
+<p:properties xmlns:p="http://schemas.microsoft.com/office/2006/metadata/properties" xmlns:xsi="http://www.w3.org/2001/XMLSchema-instance" xmlns:pc="http://schemas.microsoft.com/office/infopath/2007/PartnerControls">
+  <documentManagement/>
+</p:properties>
 </file>
 
 <file path=customXml/item4.xml><?xml version="1.0" encoding="utf-8"?>
@@ -8874,16 +8248,14 @@
 </file>
 
 <file path=customXml/item5.xml><?xml version="1.0" encoding="utf-8"?>
-<p:properties xmlns:p="http://schemas.microsoft.com/office/2006/metadata/properties" xmlns:xsi="http://www.w3.org/2001/XMLSchema-instance" xmlns:pc="http://schemas.microsoft.com/office/infopath/2007/PartnerControls">
-  <documentManagement/>
-</p:properties>
+<Session xmlns="http://schemas.business-integrity.com/dealbuilder/2006/answers"/>
+</file>
+
+<file path=customXml/item6.xml><?xml version="1.0" encoding="utf-8"?>
+<b:Sources xmlns:b="http://schemas.openxmlformats.org/officeDocument/2006/bibliography" xmlns="http://schemas.openxmlformats.org/officeDocument/2006/bibliography" SelectedStyle="\APASixthEditionOfficeOnline.xsl" StyleName="APA" Version="6"/>
 </file>
 
 <file path=customXml/itemProps1.xml><?xml version="1.0" encoding="utf-8"?>
-<ds:datastoreItem xmlns:ds="http://schemas.openxmlformats.org/officeDocument/2006/customXml" ds:itemID="{6873F3C6-29B0-4689-BACA-3B00C4C649F0}"/>
-</file>
-
-<file path=customXml/itemProps2.xml><?xml version="1.0" encoding="utf-8"?>
 <ds:datastoreItem xmlns:ds="http://schemas.openxmlformats.org/officeDocument/2006/customXml" ds:itemID="{C92DB59C-A80D-4402-A564-50EA110A9AE6}">
   <ds:schemaRefs>
     <ds:schemaRef ds:uri="http://schemas.microsoft.com/sharepoint/v3/contenttype/forms"/>
@@ -8891,10 +8263,29 @@
 </ds:datastoreItem>
 </file>
 
+<file path=customXml/itemProps2.xml><?xml version="1.0" encoding="utf-8"?>
+<ds:datastoreItem xmlns:ds="http://schemas.openxmlformats.org/officeDocument/2006/customXml" ds:itemID="{6873F3C6-29B0-4689-BACA-3B00C4C649F0}">
+  <ds:schemaRefs>
+    <ds:schemaRef ds:uri="http://schemas.microsoft.com/office/2006/metadata/contentType"/>
+    <ds:schemaRef ds:uri="http://schemas.microsoft.com/office/2006/metadata/properties/metaAttributes"/>
+    <ds:schemaRef ds:uri="http://www.w3.org/2001/XMLSchema"/>
+    <ds:schemaRef ds:uri="http://schemas.microsoft.com/office/2006/metadata/properties"/>
+    <ds:schemaRef ds:uri="554db4b9-e04f-48a1-af28-aa0b9c182b08"/>
+    <ds:schemaRef ds:uri="http://schemas.microsoft.com/office/2006/documentManagement/types"/>
+    <ds:schemaRef ds:uri="http://schemas.microsoft.com/office/infopath/2007/PartnerControls"/>
+    <ds:schemaRef ds:uri="http://schemas.openxmlformats.org/package/2006/metadata/core-properties"/>
+    <ds:schemaRef ds:uri="http://purl.org/dc/elements/1.1/"/>
+    <ds:schemaRef ds:uri="http://purl.org/dc/terms/"/>
+    <ds:schemaRef ds:uri="http://schemas.microsoft.com/internal/obd"/>
+  </ds:schemaRefs>
+</ds:datastoreItem>
+</file>
+
 <file path=customXml/itemProps3.xml><?xml version="1.0" encoding="utf-8"?>
-<ds:datastoreItem xmlns:ds="http://schemas.openxmlformats.org/officeDocument/2006/customXml" ds:itemID="{B17D58BB-A77C-4368-A0BC-DEE26B6B6221}">
+<ds:datastoreItem xmlns:ds="http://schemas.openxmlformats.org/officeDocument/2006/customXml" ds:itemID="{929CE202-2D19-40A4-A251-1D47D9450DC6}">
   <ds:schemaRefs>
-    <ds:schemaRef ds:uri="http://schemas.business-integrity.com/dealbuilder/2006/answers"/>
+    <ds:schemaRef ds:uri="http://schemas.microsoft.com/office/2006/metadata/properties"/>
+    <ds:schemaRef ds:uri="http://schemas.microsoft.com/office/infopath/2007/PartnerControls"/>
   </ds:schemaRefs>
 </ds:datastoreItem>
 </file>
@@ -8908,12 +8299,17 @@
 </file>
 
 <file path=customXml/itemProps5.xml><?xml version="1.0" encoding="utf-8"?>
-<ds:datastoreItem xmlns:ds="http://schemas.openxmlformats.org/officeDocument/2006/customXml" ds:itemID="{929CE202-2D19-40A4-A251-1D47D9450DC6}">
+<ds:datastoreItem xmlns:ds="http://schemas.openxmlformats.org/officeDocument/2006/customXml" ds:itemID="{B17D58BB-A77C-4368-A0BC-DEE26B6B6221}">
   <ds:schemaRefs>
-    <ds:schemaRef ds:uri="http://schemas.microsoft.com/office/2006/metadata/properties"/>
-    <ds:schemaRef ds:uri="http://schemas.microsoft.com/office/infopath/2007/PartnerControls"/>
-    <ds:schemaRef ds:uri="43a73130-a63d-42e7-85fe-b9b404891c8e"/>
-    <ds:schemaRef ds:uri="12f9d792-7593-4b6f-8506-e76d51e00347"/>
+    <ds:schemaRef ds:uri="http://schemas.business-integrity.com/dealbuilder/2006/answers"/>
+  </ds:schemaRefs>
+</ds:datastoreItem>
+</file>
+
+<file path=customXml/itemProps6.xml><?xml version="1.0" encoding="utf-8"?>
+<ds:datastoreItem xmlns:ds="http://schemas.openxmlformats.org/officeDocument/2006/customXml" ds:itemID="{19CFC884-064C-4929-AA3C-71D47D2FEB36}">
+  <ds:schemaRefs>
+    <ds:schemaRef ds:uri="http://schemas.openxmlformats.org/officeDocument/2006/bibliography"/>
   </ds:schemaRefs>
 </ds:datastoreItem>
 </file>
</xml_diff>